<commit_message>
V4: 6th BoD request - losses quantification added
V4: sixth Board requirement (loss quantification) added as WS3
</commit_message>
<xml_diff>
--- a/docs/RMB__BoD-2026-09-01_Action-plan_condensed.docx
+++ b/docs/RMB__BoD-2026-09-01_Action-plan_condensed.docx
@@ -133,7 +133,7 @@
                 <w:sz w:val="19"/>
                 <w:szCs w:val="19"/>
               </w:rPr>
-              <w:t xml:space="preserve">Five requirements came out of the meeting. Three of them depend on the same missing capability: RMB does not today see, systematically and in time, what is happening inside the companies it regulates. That capability is therefore built first, and the rest is sequenced around it. Five deliverables, including three working demonstrations built without budget, are ready for the Board meeting of early December 2026.</w:t>
+              <w:t xml:space="preserve">Six requirements came out of the meeting. Four of them depend on the same missing capability: RMB does not today see, systematically and in time, what is happening inside the companies it regulates. That capability is therefore built first, and the rest is sequenced around it. Six deliverables, including three working demonstrations built without budget, are ready for the Board meeting of early December 2026.</w:t>
             </w:r>
           </w:p>
           <w:p>
@@ -176,7 +176,7 @@
           <w:sz w:val="28"/>
           <w:szCs w:val="28"/>
         </w:rPr>
-        <w:t xml:space="preserve">The Board's five requirements, and the response</w:t>
+        <w:t xml:space="preserve">The Board's six requirements, and the response</w:t>
       </w:r>
     </w:p>
     <w:tbl>
@@ -621,12 +621,12 @@
                 <w:sz w:val="17"/>
                 <w:szCs w:val="17"/>
               </w:rPr>
-              <w:t xml:space="preserve">Efficient and adapted financing mechanisms and framework</w:t>
-            </w:r>
-          </w:p>
-          <w:p>
-            <w:pPr>
-              <w:shd w:fill="1B6CA8" w:color="auto" w:val="clear"/>
+              <w:t xml:space="preserve">Calculating more accurately the losses undergone by the Rwandan economy</w:t>
+            </w:r>
+          </w:p>
+          <w:p>
+            <w:pPr>
+              <w:shd w:fill="C00000" w:color="auto" w:val="clear"/>
               <w:spacing w:after="60" w:before="0" w:line="240"/>
               <w:jc w:val="center"/>
             </w:pPr>
@@ -670,7 +670,7 @@
                 <w:sz w:val="16"/>
                 <w:szCs w:val="16"/>
               </w:rPr>
-              <w:t xml:space="preserve">WS3 works on the principle that financing follows de-risking. Map, explain and model the sector's risks, both financial risks and non-financial risks with a financial impact, and build a demonstration model that prices them, by 30 November 2026. That model is what is put in front of banks, insurers and BNR to mobilise them around financing the sector rather than avoiding it.</w:t>
+              <w:t xml:space="preserve">WS3 builds a demonstration loss-quantification model covering the four categories the Board identified, populated with real contracts, invoices and assay reports over a historical period to be confirmed, with realistic, clearly flagged assumptions wherever a data gap requires one. A working model and a first defensible estimate, presented as a range rather than a false-precision figure, are ready by 15 November 2026 (D+75), ahead of the December Board meeting.</w:t>
             </w:r>
           </w:p>
         </w:tc>
@@ -744,12 +744,12 @@
                 <w:sz w:val="17"/>
                 <w:szCs w:val="17"/>
               </w:rPr>
-              <w:t xml:space="preserve">Price predictability for processing-plant investors</w:t>
-            </w:r>
-          </w:p>
-          <w:p>
-            <w:pPr>
-              <w:shd w:fill="5B2C6F" w:color="auto" w:val="clear"/>
+              <w:t xml:space="preserve">Efficient and adapted financing mechanisms and framework</w:t>
+            </w:r>
+          </w:p>
+          <w:p>
+            <w:pPr>
+              <w:shd w:fill="1B6CA8" w:color="auto" w:val="clear"/>
               <w:spacing w:after="60" w:before="0" w:line="240"/>
               <w:jc w:val="center"/>
             </w:pPr>
@@ -794,7 +794,7 @@
                 <w:sz w:val="16"/>
                 <w:szCs w:val="16"/>
               </w:rPr>
-              <w:t xml:space="preserve">WS4 maps and monitors prices and costs across the whole value chain, then separates what Rwanda can control directly (regulation, published deductions, contract minimum content) from what it can only influence indirectly (offtake contracts, index-linked formulas, hedging). A monitoring dashboard and the first quarterly outlook follow by 31 May 2027.</w:t>
+              <w:t xml:space="preserve">WS4 works on the principle that financing follows de-risking. Map, explain and model the sector's risks, both financial risks and non-financial risks with a financial impact, and build a demonstration model that prices them, by 30 November 2026. That model is what is put in front of banks, insurers and BNR to mobilise them around financing the sector rather than avoiding it.</w:t>
             </w:r>
           </w:p>
         </w:tc>
@@ -866,12 +866,12 @@
                 <w:sz w:val="17"/>
                 <w:szCs w:val="17"/>
               </w:rPr>
-              <w:t xml:space="preserve">Clear action plan with deadlines and responsibilities</w:t>
-            </w:r>
-          </w:p>
-          <w:p>
-            <w:pPr>
-              <w:shd w:fill="6B7B6F" w:color="auto" w:val="clear"/>
+              <w:t xml:space="preserve">Price predictability for processing-plant investors</w:t>
+            </w:r>
+          </w:p>
+          <w:p>
+            <w:pPr>
+              <w:shd w:fill="5B2C6F" w:color="auto" w:val="clear"/>
               <w:spacing w:after="60" w:before="0" w:line="240"/>
               <w:jc w:val="center"/>
             </w:pPr>
@@ -915,7 +915,131 @@
                 <w:sz w:val="16"/>
                 <w:szCs w:val="16"/>
               </w:rPr>
-              <w:t xml:space="preserve">This document. WS5 and WS6 give every activity a named owner, a deliverable, a start date and a due date; a dual reporting line to RMB Senior Management and to the informal Board finance committee chaired by Mr. Dorian Cyubahiro; a defined decision workflow with service levels; and a progress pack ready for the Board meeting of early December 2026.</w:t>
+              <w:t xml:space="preserve">WS5 maps and monitors prices and costs across the whole value chain, then separates what Rwanda can control directly (regulation, published deductions, contract minimum content) from what it can only influence indirectly (offtake contracts, index-linked formulas, hedging). A monitoring dashboard and the first quarterly outlook follow by 31 May 2027.</w:t>
+            </w:r>
+          </w:p>
+        </w:tc>
+      </w:tr>
+      <w:tr>
+        <w:tc>
+          <w:tcPr>
+            <w:tcW w:type="dxa" w:w="420"/>
+            <w:tcBorders>
+              <w:top w:val="single" w:color="C7D2DA" w:sz="2"/>
+              <w:left w:val="single" w:color="C7D2DA" w:sz="2"/>
+              <w:bottom w:val="single" w:color="C7D2DA" w:sz="2"/>
+              <w:right w:val="single" w:color="C7D2DA" w:sz="2"/>
+            </w:tcBorders>
+            <w:shd w:fill="F7F9FB" w:color="auto" w:val="clear"/>
+            <w:tcMar>
+              <w:top w:type="dxa" w:w="0"/>
+              <w:left w:type="dxa" w:w="80"/>
+              <w:bottom w:type="dxa" w:w="0"/>
+              <w:right w:type="dxa" w:w="80"/>
+            </w:tcMar>
+            <w:vAlign w:val="center"/>
+          </w:tcPr>
+          <w:p>
+            <w:pPr>
+              <w:spacing w:after="60" w:before="60" w:line="240"/>
+              <w:jc w:val="center"/>
+            </w:pPr>
+            <w:r>
+              <w:rPr>
+                <w:rFonts w:ascii="Aptos" w:cs="Aptos" w:eastAsia="Aptos" w:hAnsi="Aptos"/>
+                <w:b/>
+                <w:bCs/>
+                <w:color w:val="0B2A3D"/>
+                <w:sz w:val="17"/>
+                <w:szCs w:val="17"/>
+              </w:rPr>
+              <w:t xml:space="preserve">6</w:t>
+            </w:r>
+          </w:p>
+        </w:tc>
+        <w:tc>
+          <w:tcPr>
+            <w:tcW w:type="dxa" w:w="2500"/>
+            <w:tcBorders>
+              <w:top w:val="single" w:color="C7D2DA" w:sz="2"/>
+              <w:left w:val="single" w:color="C7D2DA" w:sz="2"/>
+              <w:bottom w:val="single" w:color="C7D2DA" w:sz="2"/>
+              <w:right w:val="single" w:color="C7D2DA" w:sz="2"/>
+            </w:tcBorders>
+            <w:shd w:fill="F7F9FB" w:color="auto" w:val="clear"/>
+            <w:tcMar>
+              <w:top w:type="dxa" w:w="0"/>
+              <w:left w:type="dxa" w:w="80"/>
+              <w:bottom w:type="dxa" w:w="0"/>
+              <w:right w:type="dxa" w:w="80"/>
+            </w:tcMar>
+            <w:vAlign w:val="center"/>
+          </w:tcPr>
+          <w:p>
+            <w:pPr>
+              <w:spacing w:after="20" w:before="60" w:line="240"/>
+              <w:jc w:val="left"/>
+            </w:pPr>
+            <w:r>
+              <w:rPr>
+                <w:rFonts w:ascii="Aptos" w:cs="Aptos" w:eastAsia="Aptos" w:hAnsi="Aptos"/>
+                <w:b/>
+                <w:bCs/>
+                <w:color w:val="0B2A3D"/>
+                <w:sz w:val="17"/>
+                <w:szCs w:val="17"/>
+              </w:rPr>
+              <w:t xml:space="preserve">Clear action plan with deadlines and responsibilities</w:t>
+            </w:r>
+          </w:p>
+          <w:p>
+            <w:pPr>
+              <w:shd w:fill="6B7B6F" w:color="auto" w:val="clear"/>
+              <w:spacing w:after="60" w:before="0" w:line="240"/>
+              <w:jc w:val="center"/>
+            </w:pPr>
+            <w:r>
+              <w:rPr>
+                <w:rFonts w:ascii="Aptos" w:cs="Aptos" w:eastAsia="Aptos" w:hAnsi="Aptos"/>
+                <w:color w:val="FFFFFF"/>
+                <w:sz w:val="13"/>
+                <w:szCs w:val="13"/>
+              </w:rPr>
+              <w:t xml:space="preserve">WS6</w:t>
+            </w:r>
+          </w:p>
+        </w:tc>
+        <w:tc>
+          <w:tcPr>
+            <w:tcW w:type="dxa" w:w="7286"/>
+            <w:tcBorders>
+              <w:top w:val="single" w:color="C7D2DA" w:sz="2"/>
+              <w:left w:val="single" w:color="C7D2DA" w:sz="2"/>
+              <w:bottom w:val="single" w:color="C7D2DA" w:sz="2"/>
+              <w:right w:val="single" w:color="C7D2DA" w:sz="2"/>
+            </w:tcBorders>
+            <w:shd w:fill="F7F9FB" w:color="auto" w:val="clear"/>
+            <w:tcMar>
+              <w:top w:type="dxa" w:w="0"/>
+              <w:left w:type="dxa" w:w="80"/>
+              <w:bottom w:type="dxa" w:w="0"/>
+              <w:right w:type="dxa" w:w="80"/>
+            </w:tcMar>
+            <w:vAlign w:val="center"/>
+          </w:tcPr>
+          <w:p>
+            <w:pPr>
+              <w:spacing w:after="60" w:before="60" w:line="240"/>
+              <w:jc w:val="both"/>
+            </w:pPr>
+            <w:r>
+              <w:rPr>
+                <w:rFonts w:ascii="Aptos" w:cs="Aptos" w:eastAsia="Aptos" w:hAnsi="Aptos"/>
+                <w:color w:val="1A1A1A"/>
+                <w:sz w:val="16"/>
+                <w:szCs w:val="16"/>
+              </w:rPr>
+              <w:t xml:space="preserve">This document. WS6 and WS7 give every activity a named owner, a deliverable, a start date and a due date; a dual reporting line to RMB Senior Management and to the informal Board finance committee chaired by Mr. Dorian Cyubahiro; a defined decision workflow with service levels; and a progress pack ready for the Board meeting of early December 2026.</w:t>
             </w:r>
           </w:p>
         </w:tc>
@@ -1389,7 +1513,7 @@
           </w:p>
           <w:p>
             <w:pPr>
-              <w:shd w:fill="1B6CA8" w:color="auto" w:val="clear"/>
+              <w:shd w:fill="C00000" w:color="auto" w:val="clear"/>
               <w:spacing w:after="60" w:before="0" w:line="240"/>
               <w:jc w:val="center"/>
             </w:pPr>
@@ -1433,7 +1557,7 @@
                 <w:sz w:val="16"/>
                 <w:szCs w:val="16"/>
               </w:rPr>
-              <w:t xml:space="preserve">Reduce the sector's real and perceived risk to the point where financing becomes commercially viable, and put a costed, sector-adapted financing mechanism in front of the Board and MINECOFIN.</w:t>
+              <w:t xml:space="preserve">Produce a defensible, evidence-based estimate of what the Rwandan economy has lost in mineral trading transactions over the defined historical period, broken down into payability, penalty, unpriced-content and prefinancing-interest losses, so the scale of the problem is measured rather than assumed.</w:t>
             </w:r>
           </w:p>
         </w:tc>
@@ -1468,7 +1592,7 @@
                 <w:sz w:val="16"/>
                 <w:szCs w:val="16"/>
               </w:rPr>
-              <w:t xml:space="preserve">31 May 2027 (D+272)</w:t>
+              <w:t xml:space="preserve">15 Nov 2026 (D+75)</w:t>
             </w:r>
           </w:p>
         </w:tc>
@@ -1511,7 +1635,7 @@
           </w:p>
           <w:p>
             <w:pPr>
-              <w:shd w:fill="5B2C6F" w:color="auto" w:val="clear"/>
+              <w:shd w:fill="1B6CA8" w:color="auto" w:val="clear"/>
               <w:spacing w:after="60" w:before="0" w:line="240"/>
               <w:jc w:val="center"/>
             </w:pPr>
@@ -1556,7 +1680,7 @@
                 <w:sz w:val="16"/>
                 <w:szCs w:val="16"/>
               </w:rPr>
-              <w:t xml:space="preserve">Give investors in processing capacity a defensible forward view of prices and costs, without pretending to fix a volatile market, by making explicit which components Rwanda controls, which it can only influence, and through which instruments.</w:t>
+              <w:t xml:space="preserve">Reduce the sector's real and perceived risk to the point where financing becomes commercially viable, and put a costed, sector-adapted financing mechanism in front of the Board and MINECOFIN.</w:t>
             </w:r>
           </w:p>
         </w:tc>
@@ -1634,7 +1758,7 @@
           </w:p>
           <w:p>
             <w:pPr>
-              <w:shd w:fill="6B7B6F" w:color="auto" w:val="clear"/>
+              <w:shd w:fill="5B2C6F" w:color="auto" w:val="clear"/>
               <w:spacing w:after="60" w:before="0" w:line="240"/>
               <w:jc w:val="center"/>
             </w:pPr>
@@ -1678,6 +1802,129 @@
                 <w:sz w:val="16"/>
                 <w:szCs w:val="16"/>
               </w:rPr>
+              <w:t xml:space="preserve">Give investors in processing capacity a defensible forward view of prices and costs, without pretending to fix a volatile market, by making explicit which components Rwanda controls, which it can only influence, and through which instruments.</w:t>
+            </w:r>
+          </w:p>
+        </w:tc>
+        <w:tc>
+          <w:tcPr>
+            <w:tcW w:type="dxa" w:w="2586"/>
+            <w:tcBorders>
+              <w:top w:val="single" w:color="C7D2DA" w:sz="2"/>
+              <w:left w:val="single" w:color="C7D2DA" w:sz="2"/>
+              <w:bottom w:val="single" w:color="C7D2DA" w:sz="2"/>
+              <w:right w:val="single" w:color="C7D2DA" w:sz="2"/>
+            </w:tcBorders>
+            <w:tcMar>
+              <w:top w:type="dxa" w:w="0"/>
+              <w:left w:type="dxa" w:w="80"/>
+              <w:bottom w:type="dxa" w:w="0"/>
+              <w:right w:type="dxa" w:w="80"/>
+            </w:tcMar>
+            <w:vAlign w:val="center"/>
+          </w:tcPr>
+          <w:p>
+            <w:pPr>
+              <w:spacing w:after="60" w:before="60" w:line="240"/>
+              <w:jc w:val="center"/>
+            </w:pPr>
+            <w:r>
+              <w:rPr>
+                <w:rFonts w:ascii="Aptos" w:cs="Aptos" w:eastAsia="Aptos" w:hAnsi="Aptos"/>
+                <w:b/>
+                <w:bCs/>
+                <w:color w:val="0B2A3D"/>
+                <w:sz w:val="16"/>
+                <w:szCs w:val="16"/>
+              </w:rPr>
+              <w:t xml:space="preserve">31 May 2027 (D+272)</w:t>
+            </w:r>
+          </w:p>
+        </w:tc>
+      </w:tr>
+      <w:tr>
+        <w:tc>
+          <w:tcPr>
+            <w:tcW w:type="dxa" w:w="620"/>
+            <w:tcBorders>
+              <w:top w:val="single" w:color="C7D2DA" w:sz="2"/>
+              <w:left w:val="single" w:color="C7D2DA" w:sz="2"/>
+              <w:bottom w:val="single" w:color="C7D2DA" w:sz="2"/>
+              <w:right w:val="single" w:color="C7D2DA" w:sz="2"/>
+            </w:tcBorders>
+            <w:shd w:fill="F7F9FB" w:color="auto" w:val="clear"/>
+            <w:tcMar>
+              <w:top w:type="dxa" w:w="0"/>
+              <w:left w:type="dxa" w:w="80"/>
+              <w:bottom w:type="dxa" w:w="0"/>
+              <w:right w:type="dxa" w:w="80"/>
+            </w:tcMar>
+            <w:vAlign w:val="center"/>
+          </w:tcPr>
+          <w:p>
+            <w:pPr>
+              <w:spacing w:after="16" w:before="60" w:line="240"/>
+              <w:jc w:val="center"/>
+            </w:pPr>
+            <w:r>
+              <w:rPr>
+                <w:rFonts w:ascii="Aptos" w:cs="Aptos" w:eastAsia="Aptos" w:hAnsi="Aptos"/>
+                <w:b/>
+                <w:bCs/>
+                <w:color w:val="0B2A3D"/>
+                <w:sz w:val="17"/>
+                <w:szCs w:val="17"/>
+              </w:rPr>
+              <w:t xml:space="preserve">SO6</w:t>
+            </w:r>
+          </w:p>
+          <w:p>
+            <w:pPr>
+              <w:shd w:fill="6B7B6F" w:color="auto" w:val="clear"/>
+              <w:spacing w:after="60" w:before="0" w:line="240"/>
+              <w:jc w:val="center"/>
+            </w:pPr>
+            <w:r>
+              <w:rPr>
+                <w:rFonts w:ascii="Aptos" w:cs="Aptos" w:eastAsia="Aptos" w:hAnsi="Aptos"/>
+                <w:color w:val="FFFFFF"/>
+                <w:sz w:val="13"/>
+                <w:szCs w:val="13"/>
+              </w:rPr>
+              <w:t xml:space="preserve">WS6</w:t>
+            </w:r>
+          </w:p>
+        </w:tc>
+        <w:tc>
+          <w:tcPr>
+            <w:tcW w:type="dxa" w:w="7000"/>
+            <w:tcBorders>
+              <w:top w:val="single" w:color="C7D2DA" w:sz="2"/>
+              <w:left w:val="single" w:color="C7D2DA" w:sz="2"/>
+              <w:bottom w:val="single" w:color="C7D2DA" w:sz="2"/>
+              <w:right w:val="single" w:color="C7D2DA" w:sz="2"/>
+            </w:tcBorders>
+            <w:shd w:fill="F7F9FB" w:color="auto" w:val="clear"/>
+            <w:tcMar>
+              <w:top w:type="dxa" w:w="0"/>
+              <w:left w:type="dxa" w:w="80"/>
+              <w:bottom w:type="dxa" w:w="0"/>
+              <w:right w:type="dxa" w:w="80"/>
+            </w:tcMar>
+            <w:vAlign w:val="center"/>
+          </w:tcPr>
+          <w:p>
+            <w:pPr>
+              <w:spacing w:after="60" w:before="60" w:line="240"/>
+              <w:jc w:val="both"/>
+            </w:pPr>
+            <w:r>
+              <w:rPr>
+                <w:rFonts w:ascii="Aptos" w:cs="Aptos" w:eastAsia="Aptos" w:hAnsi="Aptos"/>
+                <w:color w:val="1A1A1A"/>
+                <w:sz w:val="16"/>
+                <w:szCs w:val="16"/>
+              </w:rPr>
               <w:t xml:space="preserve">Ensure that every action carries a named owner, a deadline and a reporting channel, and that the Board sees tangible results at its December 2026 meeting rather than a progress narrative.</w:t>
             </w:r>
           </w:p>
@@ -1691,6 +1938,7 @@
               <w:bottom w:val="single" w:color="C7D2DA" w:sz="2"/>
               <w:right w:val="single" w:color="C7D2DA" w:sz="2"/>
             </w:tcBorders>
+            <w:shd w:fill="F7F9FB" w:color="auto" w:val="clear"/>
             <w:tcMar>
               <w:top w:type="dxa" w:w="0"/>
               <w:left w:type="dxa" w:w="80"/>
@@ -2061,7 +2309,7 @@
                 <w:sz w:val="14"/>
                 <w:szCs w:val="14"/>
               </w:rPr>
-              <w:t xml:space="preserve">A6.1</w:t>
+              <w:t xml:space="preserve">A7.1</w:t>
             </w:r>
           </w:p>
         </w:tc>
@@ -2291,7 +2539,7 @@
                 <w:sz w:val="17"/>
                 <w:szCs w:val="17"/>
               </w:rPr>
-              <w:t xml:space="preserve">Risk map and risk-pricing model</w:t>
+              <w:t xml:space="preserve">Loss quantification model and first estimate</w:t>
             </w:r>
           </w:p>
           <w:p>
@@ -2308,7 +2556,7 @@
                 <w:sz w:val="14"/>
                 <w:szCs w:val="14"/>
               </w:rPr>
-              <w:t xml:space="preserve">A3.1, A3.2</w:t>
+              <w:t xml:space="preserve">A3.2, A3.4</w:t>
             </w:r>
           </w:p>
         </w:tc>
@@ -2342,7 +2590,7 @@
                 <w:sz w:val="16"/>
                 <w:szCs w:val="16"/>
               </w:rPr>
-              <w:t xml:space="preserve">The sector's risks mapped, explained and modelled, covering financial risks and non-financial risks that carry a financial impact, with a demonstration model that prices them. Built to be run live with banks, insurers and BNR as the basis of a conversation about financing the sector rather than avoiding it.</w:t>
+              <w:t xml:space="preserve">A working model, in the same Streamlit style as the other demonstrations, that computes what the Rwandan economy has lost in mineral trading transactions across the four categories the Board named: payability, unexplained penalties, unpriced by-product content, and prefinancing interest. Populated with real contracts, invoices and assay reports over the historical period, with assumptions flagged wherever data is incomplete, and presented as a range rather than a single false-precision number.</w:t>
             </w:r>
           </w:p>
         </w:tc>
@@ -2378,7 +2626,7 @@
                 <w:sz w:val="16"/>
                 <w:szCs w:val="16"/>
               </w:rPr>
-              <w:t xml:space="preserve">30 Nov 2026 (D+90)</w:t>
+              <w:t xml:space="preserve">15 Nov 2026 (D+75)</w:t>
             </w:r>
           </w:p>
         </w:tc>
@@ -2415,7 +2663,7 @@
                 <w:sz w:val="17"/>
                 <w:szCs w:val="17"/>
               </w:rPr>
-              <w:t xml:space="preserve">Mapping of mineral trading companies</w:t>
+              <w:t xml:space="preserve">Risk map and risk-pricing model</w:t>
             </w:r>
           </w:p>
           <w:p>
@@ -2432,7 +2680,7 @@
                 <w:sz w:val="14"/>
                 <w:szCs w:val="14"/>
               </w:rPr>
-              <w:t xml:space="preserve">A2.2</w:t>
+              <w:t xml:space="preserve">A4.1, A4.2</w:t>
             </w:r>
           </w:p>
         </w:tc>
@@ -2465,6 +2713,130 @@
                 <w:sz w:val="16"/>
                 <w:szCs w:val="16"/>
               </w:rPr>
+              <w:t xml:space="preserve">The sector's risks mapped, explained and modelled, covering financial risks and non-financial risks that carry a financial impact, with a demonstration model that prices them. Built to be run live with banks, insurers and BNR as the basis of a conversation about financing the sector rather than avoiding it.</w:t>
+            </w:r>
+          </w:p>
+        </w:tc>
+        <w:tc>
+          <w:tcPr>
+            <w:tcW w:type="dxa" w:w="1700"/>
+            <w:tcBorders>
+              <w:top w:val="single" w:color="C7D2DA" w:sz="2"/>
+              <w:left w:val="single" w:color="C7D2DA" w:sz="2"/>
+              <w:bottom w:val="single" w:color="C7D2DA" w:sz="2"/>
+              <w:right w:val="single" w:color="C7D2DA" w:sz="2"/>
+            </w:tcBorders>
+            <w:tcMar>
+              <w:top w:type="dxa" w:w="0"/>
+              <w:left w:type="dxa" w:w="80"/>
+              <w:bottom w:type="dxa" w:w="0"/>
+              <w:right w:type="dxa" w:w="80"/>
+            </w:tcMar>
+            <w:vAlign w:val="center"/>
+          </w:tcPr>
+          <w:p>
+            <w:pPr>
+              <w:spacing w:after="60" w:before="60" w:line="240"/>
+              <w:jc w:val="center"/>
+            </w:pPr>
+            <w:r>
+              <w:rPr>
+                <w:rFonts w:ascii="Aptos" w:cs="Aptos" w:eastAsia="Aptos" w:hAnsi="Aptos"/>
+                <w:b/>
+                <w:bCs/>
+                <w:color w:val="0B2A3D"/>
+                <w:sz w:val="16"/>
+                <w:szCs w:val="16"/>
+              </w:rPr>
+              <w:t xml:space="preserve">30 Nov 2026 (D+90)</w:t>
+            </w:r>
+          </w:p>
+        </w:tc>
+      </w:tr>
+      <w:tr>
+        <w:tc>
+          <w:tcPr>
+            <w:tcW w:type="dxa" w:w="2700"/>
+            <w:tcBorders>
+              <w:top w:val="single" w:color="C7D2DA" w:sz="2"/>
+              <w:left w:val="single" w:color="C7D2DA" w:sz="2"/>
+              <w:bottom w:val="single" w:color="C7D2DA" w:sz="2"/>
+              <w:right w:val="single" w:color="C7D2DA" w:sz="2"/>
+            </w:tcBorders>
+            <w:shd w:fill="F7F9FB" w:color="auto" w:val="clear"/>
+            <w:tcMar>
+              <w:top w:type="dxa" w:w="0"/>
+              <w:left w:type="dxa" w:w="80"/>
+              <w:bottom w:type="dxa" w:w="0"/>
+              <w:right w:type="dxa" w:w="80"/>
+            </w:tcMar>
+            <w:vAlign w:val="center"/>
+          </w:tcPr>
+          <w:p>
+            <w:pPr>
+              <w:spacing w:after="16" w:before="60" w:line="240"/>
+              <w:jc w:val="left"/>
+            </w:pPr>
+            <w:r>
+              <w:rPr>
+                <w:rFonts w:ascii="Aptos" w:cs="Aptos" w:eastAsia="Aptos" w:hAnsi="Aptos"/>
+                <w:b/>
+                <w:bCs/>
+                <w:color w:val="0B2A3D"/>
+                <w:sz w:val="17"/>
+                <w:szCs w:val="17"/>
+              </w:rPr>
+              <w:t xml:space="preserve">Mapping of mineral trading companies</w:t>
+            </w:r>
+          </w:p>
+          <w:p>
+            <w:pPr>
+              <w:spacing w:after="60" w:before="0" w:line="240"/>
+              <w:jc w:val="left"/>
+            </w:pPr>
+            <w:r>
+              <w:rPr>
+                <w:rFonts w:ascii="Aptos" w:cs="Aptos" w:eastAsia="Aptos" w:hAnsi="Aptos"/>
+                <w:i/>
+                <w:iCs/>
+                <w:color w:val="6B7A87"/>
+                <w:sz w:val="14"/>
+                <w:szCs w:val="14"/>
+              </w:rPr>
+              <w:t xml:space="preserve">A2.2</w:t>
+            </w:r>
+          </w:p>
+        </w:tc>
+        <w:tc>
+          <w:tcPr>
+            <w:tcW w:type="dxa" w:w="5806"/>
+            <w:tcBorders>
+              <w:top w:val="single" w:color="C7D2DA" w:sz="2"/>
+              <w:left w:val="single" w:color="C7D2DA" w:sz="2"/>
+              <w:bottom w:val="single" w:color="C7D2DA" w:sz="2"/>
+              <w:right w:val="single" w:color="C7D2DA" w:sz="2"/>
+            </w:tcBorders>
+            <w:shd w:fill="F7F9FB" w:color="auto" w:val="clear"/>
+            <w:tcMar>
+              <w:top w:type="dxa" w:w="0"/>
+              <w:left w:type="dxa" w:w="80"/>
+              <w:bottom w:type="dxa" w:w="0"/>
+              <w:right w:type="dxa" w:w="80"/>
+            </w:tcMar>
+            <w:vAlign w:val="center"/>
+          </w:tcPr>
+          <w:p>
+            <w:pPr>
+              <w:spacing w:after="60" w:before="60" w:line="240"/>
+              <w:jc w:val="both"/>
+            </w:pPr>
+            <w:r>
+              <w:rPr>
+                <w:rFonts w:ascii="Aptos" w:cs="Aptos" w:eastAsia="Aptos" w:hAnsi="Aptos"/>
+                <w:color w:val="1A1A1A"/>
+                <w:sz w:val="16"/>
+                <w:szCs w:val="16"/>
+              </w:rPr>
               <w:t xml:space="preserve">Every licensed mineral trading company classified by activity level, by cash-flow movement (cash in against cash out) and by compliance with mandatory reporting, so that dormant and near-dormant holders are identified and reminded of their obligations before any revocation is considered.</w:t>
             </w:r>
           </w:p>
@@ -2478,6 +2850,7 @@
               <w:bottom w:val="single" w:color="C7D2DA" w:sz="2"/>
               <w:right w:val="single" w:color="C7D2DA" w:sz="2"/>
             </w:tcBorders>
+            <w:shd w:fill="F7F9FB" w:color="auto" w:val="clear"/>
             <w:tcMar>
               <w:top w:type="dxa" w:w="0"/>
               <w:left w:type="dxa" w:w="80"/>
@@ -3940,7 +4313,7 @@
                 <w:sz w:val="15"/>
                 <w:szCs w:val="15"/>
               </w:rPr>
-              <w:t xml:space="preserve">WS3, Sector de-risking and financing framework</w:t>
+              <w:t xml:space="preserve">WS3, Quantification of losses to the Rwandan economy</w:t>
             </w:r>
           </w:p>
         </w:tc>
@@ -3973,7 +4346,7 @@
                 <w:sz w:val="14"/>
                 <w:szCs w:val="14"/>
               </w:rPr>
-              <w:t xml:space="preserve">01 Oct 2026</w:t>
+              <w:t xml:space="preserve">08 Sep 2026</w:t>
             </w:r>
           </w:p>
         </w:tc>
@@ -4008,7 +4381,7 @@
                 <w:sz w:val="14"/>
                 <w:szCs w:val="14"/>
               </w:rPr>
-              <w:t xml:space="preserve">31 May 2027</w:t>
+              <w:t xml:space="preserve">15 Nov 2026</w:t>
             </w:r>
           </w:p>
         </w:tc>
@@ -4021,6 +4394,108 @@
               <w:bottom w:val="single" w:color="C7D2DA" w:sz="2"/>
               <w:right w:val="single" w:color="C7D2DA" w:sz="2"/>
             </w:tcBorders>
+            <w:shd w:fill="C00000" w:color="auto" w:val="clear"/>
+            <w:tcMar>
+              <w:top w:type="dxa" w:w="0"/>
+              <w:left w:type="dxa" w:w="80"/>
+              <w:bottom w:type="dxa" w:w="0"/>
+              <w:right w:type="dxa" w:w="80"/>
+            </w:tcMar>
+            <w:vAlign w:val="center"/>
+          </w:tcPr>
+          <w:p>
+            <w:pPr>
+              <w:spacing w:after="60" w:before="60" w:line="240"/>
+              <w:jc w:val="left"/>
+            </w:pPr>
+            <w:r>
+              <w:rPr>
+                <w:rFonts w:ascii="Aptos" w:cs="Aptos" w:eastAsia="Aptos" w:hAnsi="Aptos"/>
+                <w:color w:val="1A1A1A"/>
+                <w:sz w:val="14"/>
+                <w:szCs w:val="14"/>
+              </w:rPr>
+              <w:t xml:space="preserve"> </w:t>
+            </w:r>
+          </w:p>
+        </w:tc>
+        <w:tc>
+          <w:tcPr>
+            <w:tcW w:type="dxa" w:w="620"/>
+            <w:tcBorders>
+              <w:top w:val="single" w:color="C7D2DA" w:sz="2"/>
+              <w:left w:val="single" w:color="C7D2DA" w:sz="2"/>
+              <w:bottom w:val="single" w:color="C7D2DA" w:sz="2"/>
+              <w:right w:val="single" w:color="C7D2DA" w:sz="2"/>
+            </w:tcBorders>
+            <w:shd w:fill="C00000" w:color="auto" w:val="clear"/>
+            <w:tcMar>
+              <w:top w:type="dxa" w:w="0"/>
+              <w:left w:type="dxa" w:w="80"/>
+              <w:bottom w:type="dxa" w:w="0"/>
+              <w:right w:type="dxa" w:w="80"/>
+            </w:tcMar>
+            <w:vAlign w:val="center"/>
+          </w:tcPr>
+          <w:p>
+            <w:pPr>
+              <w:spacing w:after="60" w:before="60" w:line="240"/>
+              <w:jc w:val="left"/>
+            </w:pPr>
+            <w:r>
+              <w:rPr>
+                <w:rFonts w:ascii="Aptos" w:cs="Aptos" w:eastAsia="Aptos" w:hAnsi="Aptos"/>
+                <w:color w:val="1A1A1A"/>
+                <w:sz w:val="14"/>
+                <w:szCs w:val="14"/>
+              </w:rPr>
+              <w:t xml:space="preserve"> </w:t>
+            </w:r>
+          </w:p>
+        </w:tc>
+        <w:tc>
+          <w:tcPr>
+            <w:tcW w:type="dxa" w:w="620"/>
+            <w:tcBorders>
+              <w:top w:val="single" w:color="C7D2DA" w:sz="2"/>
+              <w:left w:val="single" w:color="C7D2DA" w:sz="2"/>
+              <w:bottom w:val="single" w:color="C7D2DA" w:sz="2"/>
+              <w:right w:val="single" w:color="C7D2DA" w:sz="2"/>
+            </w:tcBorders>
+            <w:shd w:fill="C00000" w:color="auto" w:val="clear"/>
+            <w:tcMar>
+              <w:top w:type="dxa" w:w="0"/>
+              <w:left w:type="dxa" w:w="80"/>
+              <w:bottom w:type="dxa" w:w="0"/>
+              <w:right w:type="dxa" w:w="80"/>
+            </w:tcMar>
+            <w:vAlign w:val="center"/>
+          </w:tcPr>
+          <w:p>
+            <w:pPr>
+              <w:spacing w:after="60" w:before="60" w:line="240"/>
+              <w:jc w:val="left"/>
+            </w:pPr>
+            <w:r>
+              <w:rPr>
+                <w:rFonts w:ascii="Aptos" w:cs="Aptos" w:eastAsia="Aptos" w:hAnsi="Aptos"/>
+                <w:color w:val="1A1A1A"/>
+                <w:sz w:val="14"/>
+                <w:szCs w:val="14"/>
+              </w:rPr>
+              <w:t xml:space="preserve"> </w:t>
+            </w:r>
+          </w:p>
+        </w:tc>
+        <w:tc>
+          <w:tcPr>
+            <w:tcW w:type="dxa" w:w="620"/>
+            <w:tcBorders>
+              <w:top w:val="single" w:color="C7D2DA" w:sz="2"/>
+              <w:left w:val="single" w:color="C7D2DA" w:sz="2"/>
+              <w:bottom w:val="single" w:color="C7D2DA" w:sz="2"/>
+              <w:right w:val="single" w:color="C7D2DA" w:sz="2"/>
+            </w:tcBorders>
             <w:shd w:fill="FFFFFF" w:color="auto" w:val="clear"/>
             <w:tcMar>
               <w:top w:type="dxa" w:w="0"/>
@@ -4055,7 +4530,7 @@
               <w:bottom w:val="single" w:color="C7D2DA" w:sz="2"/>
               <w:right w:val="single" w:color="C7D2DA" w:sz="2"/>
             </w:tcBorders>
-            <w:shd w:fill="1B6CA8" w:color="auto" w:val="clear"/>
+            <w:shd w:fill="FFFFFF" w:color="auto" w:val="clear"/>
             <w:tcMar>
               <w:top w:type="dxa" w:w="0"/>
               <w:left w:type="dxa" w:w="80"/>
@@ -4089,7 +4564,7 @@
               <w:bottom w:val="single" w:color="C7D2DA" w:sz="2"/>
               <w:right w:val="single" w:color="C7D2DA" w:sz="2"/>
             </w:tcBorders>
-            <w:shd w:fill="1B6CA8" w:color="auto" w:val="clear"/>
+            <w:shd w:fill="FFFFFF" w:color="auto" w:val="clear"/>
             <w:tcMar>
               <w:top w:type="dxa" w:w="0"/>
               <w:left w:type="dxa" w:w="80"/>
@@ -4123,7 +4598,7 @@
               <w:bottom w:val="single" w:color="C7D2DA" w:sz="2"/>
               <w:right w:val="single" w:color="C7D2DA" w:sz="2"/>
             </w:tcBorders>
-            <w:shd w:fill="1B6CA8" w:color="auto" w:val="clear"/>
+            <w:shd w:fill="FFFFFF" w:color="auto" w:val="clear"/>
             <w:tcMar>
               <w:top w:type="dxa" w:w="0"/>
               <w:left w:type="dxa" w:w="80"/>
@@ -4157,7 +4632,7 @@
               <w:bottom w:val="single" w:color="C7D2DA" w:sz="2"/>
               <w:right w:val="single" w:color="C7D2DA" w:sz="2"/>
             </w:tcBorders>
-            <w:shd w:fill="1B6CA8" w:color="auto" w:val="clear"/>
+            <w:shd w:fill="FFFFFF" w:color="auto" w:val="clear"/>
             <w:tcMar>
               <w:top w:type="dxa" w:w="0"/>
               <w:left w:type="dxa" w:w="80"/>
@@ -4191,109 +4666,7 @@
               <w:bottom w:val="single" w:color="C7D2DA" w:sz="2"/>
               <w:right w:val="single" w:color="C7D2DA" w:sz="2"/>
             </w:tcBorders>
-            <w:shd w:fill="1B6CA8" w:color="auto" w:val="clear"/>
-            <w:tcMar>
-              <w:top w:type="dxa" w:w="0"/>
-              <w:left w:type="dxa" w:w="80"/>
-              <w:bottom w:type="dxa" w:w="0"/>
-              <w:right w:type="dxa" w:w="80"/>
-            </w:tcMar>
-            <w:vAlign w:val="center"/>
-          </w:tcPr>
-          <w:p>
-            <w:pPr>
-              <w:spacing w:after="60" w:before="60" w:line="240"/>
-              <w:jc w:val="left"/>
-            </w:pPr>
-            <w:r>
-              <w:rPr>
-                <w:rFonts w:ascii="Aptos" w:cs="Aptos" w:eastAsia="Aptos" w:hAnsi="Aptos"/>
-                <w:color w:val="1A1A1A"/>
-                <w:sz w:val="14"/>
-                <w:szCs w:val="14"/>
-              </w:rPr>
-              <w:t xml:space="preserve"> </w:t>
-            </w:r>
-          </w:p>
-        </w:tc>
-        <w:tc>
-          <w:tcPr>
-            <w:tcW w:type="dxa" w:w="620"/>
-            <w:tcBorders>
-              <w:top w:val="single" w:color="C7D2DA" w:sz="2"/>
-              <w:left w:val="single" w:color="C7D2DA" w:sz="2"/>
-              <w:bottom w:val="single" w:color="C7D2DA" w:sz="2"/>
-              <w:right w:val="single" w:color="C7D2DA" w:sz="2"/>
-            </w:tcBorders>
-            <w:shd w:fill="1B6CA8" w:color="auto" w:val="clear"/>
-            <w:tcMar>
-              <w:top w:type="dxa" w:w="0"/>
-              <w:left w:type="dxa" w:w="80"/>
-              <w:bottom w:type="dxa" w:w="0"/>
-              <w:right w:type="dxa" w:w="80"/>
-            </w:tcMar>
-            <w:vAlign w:val="center"/>
-          </w:tcPr>
-          <w:p>
-            <w:pPr>
-              <w:spacing w:after="60" w:before="60" w:line="240"/>
-              <w:jc w:val="left"/>
-            </w:pPr>
-            <w:r>
-              <w:rPr>
-                <w:rFonts w:ascii="Aptos" w:cs="Aptos" w:eastAsia="Aptos" w:hAnsi="Aptos"/>
-                <w:color w:val="1A1A1A"/>
-                <w:sz w:val="14"/>
-                <w:szCs w:val="14"/>
-              </w:rPr>
-              <w:t xml:space="preserve"> </w:t>
-            </w:r>
-          </w:p>
-        </w:tc>
-        <w:tc>
-          <w:tcPr>
-            <w:tcW w:type="dxa" w:w="620"/>
-            <w:tcBorders>
-              <w:top w:val="single" w:color="C7D2DA" w:sz="2"/>
-              <w:left w:val="single" w:color="C7D2DA" w:sz="2"/>
-              <w:bottom w:val="single" w:color="C7D2DA" w:sz="2"/>
-              <w:right w:val="single" w:color="C7D2DA" w:sz="2"/>
-            </w:tcBorders>
-            <w:shd w:fill="1B6CA8" w:color="auto" w:val="clear"/>
-            <w:tcMar>
-              <w:top w:type="dxa" w:w="0"/>
-              <w:left w:type="dxa" w:w="80"/>
-              <w:bottom w:type="dxa" w:w="0"/>
-              <w:right w:type="dxa" w:w="80"/>
-            </w:tcMar>
-            <w:vAlign w:val="center"/>
-          </w:tcPr>
-          <w:p>
-            <w:pPr>
-              <w:spacing w:after="60" w:before="60" w:line="240"/>
-              <w:jc w:val="left"/>
-            </w:pPr>
-            <w:r>
-              <w:rPr>
-                <w:rFonts w:ascii="Aptos" w:cs="Aptos" w:eastAsia="Aptos" w:hAnsi="Aptos"/>
-                <w:color w:val="1A1A1A"/>
-                <w:sz w:val="14"/>
-                <w:szCs w:val="14"/>
-              </w:rPr>
-              <w:t xml:space="preserve"> </w:t>
-            </w:r>
-          </w:p>
-        </w:tc>
-        <w:tc>
-          <w:tcPr>
-            <w:tcW w:type="dxa" w:w="620"/>
-            <w:tcBorders>
-              <w:top w:val="single" w:color="C7D2DA" w:sz="2"/>
-              <w:left w:val="single" w:color="C7D2DA" w:sz="2"/>
-              <w:bottom w:val="single" w:color="C7D2DA" w:sz="2"/>
-              <w:right w:val="single" w:color="C7D2DA" w:sz="2"/>
-            </w:tcBorders>
-            <w:shd w:fill="1B6CA8" w:color="auto" w:val="clear"/>
+            <w:shd w:fill="FFFFFF" w:color="auto" w:val="clear"/>
             <w:tcMar>
               <w:top w:type="dxa" w:w="0"/>
               <w:left w:type="dxa" w:w="80"/>
@@ -4352,7 +4725,7 @@
                 <w:sz w:val="15"/>
                 <w:szCs w:val="15"/>
               </w:rPr>
-              <w:t xml:space="preserve">WS4, Prices predictability for processing-plant investors</w:t>
+              <w:t xml:space="preserve">WS4, Sector de-risking and financing framework</w:t>
             </w:r>
           </w:p>
         </w:tc>
@@ -4386,7 +4759,7 @@
                 <w:sz w:val="14"/>
                 <w:szCs w:val="14"/>
               </w:rPr>
-              <w:t xml:space="preserve">01 Nov 2026</w:t>
+              <w:t xml:space="preserve">01 Oct 2026</w:t>
             </w:r>
           </w:p>
         </w:tc>
@@ -4469,7 +4842,7 @@
               <w:bottom w:val="single" w:color="C7D2DA" w:sz="2"/>
               <w:right w:val="single" w:color="C7D2DA" w:sz="2"/>
             </w:tcBorders>
-            <w:shd w:fill="F7F9FB" w:color="auto" w:val="clear"/>
+            <w:shd w:fill="1B6CA8" w:color="auto" w:val="clear"/>
             <w:tcMar>
               <w:top w:type="dxa" w:w="0"/>
               <w:left w:type="dxa" w:w="80"/>
@@ -4503,7 +4876,7 @@
               <w:bottom w:val="single" w:color="C7D2DA" w:sz="2"/>
               <w:right w:val="single" w:color="C7D2DA" w:sz="2"/>
             </w:tcBorders>
-            <w:shd w:fill="5B2C6F" w:color="auto" w:val="clear"/>
+            <w:shd w:fill="1B6CA8" w:color="auto" w:val="clear"/>
             <w:tcMar>
               <w:top w:type="dxa" w:w="0"/>
               <w:left w:type="dxa" w:w="80"/>
@@ -4537,7 +4910,7 @@
               <w:bottom w:val="single" w:color="C7D2DA" w:sz="2"/>
               <w:right w:val="single" w:color="C7D2DA" w:sz="2"/>
             </w:tcBorders>
-            <w:shd w:fill="5B2C6F" w:color="auto" w:val="clear"/>
+            <w:shd w:fill="1B6CA8" w:color="auto" w:val="clear"/>
             <w:tcMar>
               <w:top w:type="dxa" w:w="0"/>
               <w:left w:type="dxa" w:w="80"/>
@@ -4571,7 +4944,7 @@
               <w:bottom w:val="single" w:color="C7D2DA" w:sz="2"/>
               <w:right w:val="single" w:color="C7D2DA" w:sz="2"/>
             </w:tcBorders>
-            <w:shd w:fill="5B2C6F" w:color="auto" w:val="clear"/>
+            <w:shd w:fill="1B6CA8" w:color="auto" w:val="clear"/>
             <w:tcMar>
               <w:top w:type="dxa" w:w="0"/>
               <w:left w:type="dxa" w:w="80"/>
@@ -4605,7 +4978,7 @@
               <w:bottom w:val="single" w:color="C7D2DA" w:sz="2"/>
               <w:right w:val="single" w:color="C7D2DA" w:sz="2"/>
             </w:tcBorders>
-            <w:shd w:fill="5B2C6F" w:color="auto" w:val="clear"/>
+            <w:shd w:fill="1B6CA8" w:color="auto" w:val="clear"/>
             <w:tcMar>
               <w:top w:type="dxa" w:w="0"/>
               <w:left w:type="dxa" w:w="80"/>
@@ -4639,7 +5012,7 @@
               <w:bottom w:val="single" w:color="C7D2DA" w:sz="2"/>
               <w:right w:val="single" w:color="C7D2DA" w:sz="2"/>
             </w:tcBorders>
-            <w:shd w:fill="5B2C6F" w:color="auto" w:val="clear"/>
+            <w:shd w:fill="1B6CA8" w:color="auto" w:val="clear"/>
             <w:tcMar>
               <w:top w:type="dxa" w:w="0"/>
               <w:left w:type="dxa" w:w="80"/>
@@ -4673,7 +5046,7 @@
               <w:bottom w:val="single" w:color="C7D2DA" w:sz="2"/>
               <w:right w:val="single" w:color="C7D2DA" w:sz="2"/>
             </w:tcBorders>
-            <w:shd w:fill="5B2C6F" w:color="auto" w:val="clear"/>
+            <w:shd w:fill="1B6CA8" w:color="auto" w:val="clear"/>
             <w:tcMar>
               <w:top w:type="dxa" w:w="0"/>
               <w:left w:type="dxa" w:w="80"/>
@@ -4707,7 +5080,7 @@
               <w:bottom w:val="single" w:color="C7D2DA" w:sz="2"/>
               <w:right w:val="single" w:color="C7D2DA" w:sz="2"/>
             </w:tcBorders>
-            <w:shd w:fill="5B2C6F" w:color="auto" w:val="clear"/>
+            <w:shd w:fill="1B6CA8" w:color="auto" w:val="clear"/>
             <w:tcMar>
               <w:top w:type="dxa" w:w="0"/>
               <w:left w:type="dxa" w:w="80"/>
@@ -4765,7 +5138,7 @@
                 <w:sz w:val="15"/>
                 <w:szCs w:val="15"/>
               </w:rPr>
-              <w:t xml:space="preserve">WS5, Programme mobilisation and governance</w:t>
+              <w:t xml:space="preserve">WS5, Prices predictability for processing-plant investors</w:t>
             </w:r>
           </w:p>
         </w:tc>
@@ -4798,7 +5171,7 @@
                 <w:sz w:val="14"/>
                 <w:szCs w:val="14"/>
               </w:rPr>
-              <w:t xml:space="preserve">05 Sep 2026</w:t>
+              <w:t xml:space="preserve">01 Nov 2026</w:t>
             </w:r>
           </w:p>
         </w:tc>
@@ -4833,7 +5206,7 @@
                 <w:sz w:val="14"/>
                 <w:szCs w:val="14"/>
               </w:rPr>
-              <w:t xml:space="preserve">30 Nov 2026</w:t>
+              <w:t xml:space="preserve">31 May 2027</w:t>
             </w:r>
           </w:p>
         </w:tc>
@@ -4846,7 +5219,7 @@
               <w:bottom w:val="single" w:color="C7D2DA" w:sz="2"/>
               <w:right w:val="single" w:color="C7D2DA" w:sz="2"/>
             </w:tcBorders>
-            <w:shd w:fill="6B7B6F" w:color="auto" w:val="clear"/>
+            <w:shd w:fill="FFFFFF" w:color="auto" w:val="clear"/>
             <w:tcMar>
               <w:top w:type="dxa" w:w="0"/>
               <w:left w:type="dxa" w:w="80"/>
@@ -4880,7 +5253,7 @@
               <w:bottom w:val="single" w:color="C7D2DA" w:sz="2"/>
               <w:right w:val="single" w:color="C7D2DA" w:sz="2"/>
             </w:tcBorders>
-            <w:shd w:fill="6B7B6F" w:color="auto" w:val="clear"/>
+            <w:shd w:fill="FFFFFF" w:color="auto" w:val="clear"/>
             <w:tcMar>
               <w:top w:type="dxa" w:w="0"/>
               <w:left w:type="dxa" w:w="80"/>
@@ -4914,7 +5287,7 @@
               <w:bottom w:val="single" w:color="C7D2DA" w:sz="2"/>
               <w:right w:val="single" w:color="C7D2DA" w:sz="2"/>
             </w:tcBorders>
-            <w:shd w:fill="6B7B6F" w:color="auto" w:val="clear"/>
+            <w:shd w:fill="5B2C6F" w:color="auto" w:val="clear"/>
             <w:tcMar>
               <w:top w:type="dxa" w:w="0"/>
               <w:left w:type="dxa" w:w="80"/>
@@ -4948,7 +5321,7 @@
               <w:bottom w:val="single" w:color="C7D2DA" w:sz="2"/>
               <w:right w:val="single" w:color="C7D2DA" w:sz="2"/>
             </w:tcBorders>
-            <w:shd w:fill="FFFFFF" w:color="auto" w:val="clear"/>
+            <w:shd w:fill="5B2C6F" w:color="auto" w:val="clear"/>
             <w:tcMar>
               <w:top w:type="dxa" w:w="0"/>
               <w:left w:type="dxa" w:w="80"/>
@@ -4982,7 +5355,7 @@
               <w:bottom w:val="single" w:color="C7D2DA" w:sz="2"/>
               <w:right w:val="single" w:color="C7D2DA" w:sz="2"/>
             </w:tcBorders>
-            <w:shd w:fill="FFFFFF" w:color="auto" w:val="clear"/>
+            <w:shd w:fill="5B2C6F" w:color="auto" w:val="clear"/>
             <w:tcMar>
               <w:top w:type="dxa" w:w="0"/>
               <w:left w:type="dxa" w:w="80"/>
@@ -5016,7 +5389,7 @@
               <w:bottom w:val="single" w:color="C7D2DA" w:sz="2"/>
               <w:right w:val="single" w:color="C7D2DA" w:sz="2"/>
             </w:tcBorders>
-            <w:shd w:fill="FFFFFF" w:color="auto" w:val="clear"/>
+            <w:shd w:fill="5B2C6F" w:color="auto" w:val="clear"/>
             <w:tcMar>
               <w:top w:type="dxa" w:w="0"/>
               <w:left w:type="dxa" w:w="80"/>
@@ -5050,7 +5423,7 @@
               <w:bottom w:val="single" w:color="C7D2DA" w:sz="2"/>
               <w:right w:val="single" w:color="C7D2DA" w:sz="2"/>
             </w:tcBorders>
-            <w:shd w:fill="FFFFFF" w:color="auto" w:val="clear"/>
+            <w:shd w:fill="5B2C6F" w:color="auto" w:val="clear"/>
             <w:tcMar>
               <w:top w:type="dxa" w:w="0"/>
               <w:left w:type="dxa" w:w="80"/>
@@ -5084,7 +5457,7 @@
               <w:bottom w:val="single" w:color="C7D2DA" w:sz="2"/>
               <w:right w:val="single" w:color="C7D2DA" w:sz="2"/>
             </w:tcBorders>
-            <w:shd w:fill="FFFFFF" w:color="auto" w:val="clear"/>
+            <w:shd w:fill="5B2C6F" w:color="auto" w:val="clear"/>
             <w:tcMar>
               <w:top w:type="dxa" w:w="0"/>
               <w:left w:type="dxa" w:w="80"/>
@@ -5118,7 +5491,7 @@
               <w:bottom w:val="single" w:color="C7D2DA" w:sz="2"/>
               <w:right w:val="single" w:color="C7D2DA" w:sz="2"/>
             </w:tcBorders>
-            <w:shd w:fill="FFFFFF" w:color="auto" w:val="clear"/>
+            <w:shd w:fill="5B2C6F" w:color="auto" w:val="clear"/>
             <w:tcMar>
               <w:top w:type="dxa" w:w="0"/>
               <w:left w:type="dxa" w:w="80"/>
@@ -5177,7 +5550,7 @@
                 <w:sz w:val="15"/>
                 <w:szCs w:val="15"/>
               </w:rPr>
-              <w:t xml:space="preserve">WS6, Decision-making ecosystem, automation and AI (cross-cutting)</w:t>
+              <w:t xml:space="preserve">WS6, Programme mobilisation and governance</w:t>
             </w:r>
           </w:p>
         </w:tc>
@@ -5211,6 +5584,418 @@
                 <w:sz w:val="14"/>
                 <w:szCs w:val="14"/>
               </w:rPr>
+              <w:t xml:space="preserve">05 Sep 2026</w:t>
+            </w:r>
+          </w:p>
+        </w:tc>
+        <w:tc>
+          <w:tcPr>
+            <w:tcW w:type="dxa" w:w="1400"/>
+            <w:tcBorders>
+              <w:top w:val="single" w:color="C7D2DA" w:sz="2"/>
+              <w:left w:val="single" w:color="C7D2DA" w:sz="2"/>
+              <w:bottom w:val="single" w:color="C7D2DA" w:sz="2"/>
+              <w:right w:val="single" w:color="C7D2DA" w:sz="2"/>
+            </w:tcBorders>
+            <w:shd w:fill="F7F9FB" w:color="auto" w:val="clear"/>
+            <w:tcMar>
+              <w:top w:type="dxa" w:w="0"/>
+              <w:left w:type="dxa" w:w="80"/>
+              <w:bottom w:type="dxa" w:w="0"/>
+              <w:right w:type="dxa" w:w="80"/>
+            </w:tcMar>
+            <w:vAlign w:val="center"/>
+          </w:tcPr>
+          <w:p>
+            <w:pPr>
+              <w:spacing w:after="60" w:before="60" w:line="240"/>
+              <w:jc w:val="center"/>
+            </w:pPr>
+            <w:r>
+              <w:rPr>
+                <w:rFonts w:ascii="Aptos" w:cs="Aptos" w:eastAsia="Aptos" w:hAnsi="Aptos"/>
+                <w:b/>
+                <w:bCs/>
+                <w:color w:val="0B2A3D"/>
+                <w:sz w:val="14"/>
+                <w:szCs w:val="14"/>
+              </w:rPr>
+              <w:t xml:space="preserve">30 Nov 2026</w:t>
+            </w:r>
+          </w:p>
+        </w:tc>
+        <w:tc>
+          <w:tcPr>
+            <w:tcW w:type="dxa" w:w="620"/>
+            <w:tcBorders>
+              <w:top w:val="single" w:color="C7D2DA" w:sz="2"/>
+              <w:left w:val="single" w:color="C7D2DA" w:sz="2"/>
+              <w:bottom w:val="single" w:color="C7D2DA" w:sz="2"/>
+              <w:right w:val="single" w:color="C7D2DA" w:sz="2"/>
+            </w:tcBorders>
+            <w:shd w:fill="6B7B6F" w:color="auto" w:val="clear"/>
+            <w:tcMar>
+              <w:top w:type="dxa" w:w="0"/>
+              <w:left w:type="dxa" w:w="80"/>
+              <w:bottom w:type="dxa" w:w="0"/>
+              <w:right w:type="dxa" w:w="80"/>
+            </w:tcMar>
+            <w:vAlign w:val="center"/>
+          </w:tcPr>
+          <w:p>
+            <w:pPr>
+              <w:spacing w:after="60" w:before="60" w:line="240"/>
+              <w:jc w:val="left"/>
+            </w:pPr>
+            <w:r>
+              <w:rPr>
+                <w:rFonts w:ascii="Aptos" w:cs="Aptos" w:eastAsia="Aptos" w:hAnsi="Aptos"/>
+                <w:color w:val="1A1A1A"/>
+                <w:sz w:val="14"/>
+                <w:szCs w:val="14"/>
+              </w:rPr>
+              <w:t xml:space="preserve"> </w:t>
+            </w:r>
+          </w:p>
+        </w:tc>
+        <w:tc>
+          <w:tcPr>
+            <w:tcW w:type="dxa" w:w="620"/>
+            <w:tcBorders>
+              <w:top w:val="single" w:color="C7D2DA" w:sz="2"/>
+              <w:left w:val="single" w:color="C7D2DA" w:sz="2"/>
+              <w:bottom w:val="single" w:color="C7D2DA" w:sz="2"/>
+              <w:right w:val="single" w:color="C7D2DA" w:sz="2"/>
+            </w:tcBorders>
+            <w:shd w:fill="6B7B6F" w:color="auto" w:val="clear"/>
+            <w:tcMar>
+              <w:top w:type="dxa" w:w="0"/>
+              <w:left w:type="dxa" w:w="80"/>
+              <w:bottom w:type="dxa" w:w="0"/>
+              <w:right w:type="dxa" w:w="80"/>
+            </w:tcMar>
+            <w:vAlign w:val="center"/>
+          </w:tcPr>
+          <w:p>
+            <w:pPr>
+              <w:spacing w:after="60" w:before="60" w:line="240"/>
+              <w:jc w:val="left"/>
+            </w:pPr>
+            <w:r>
+              <w:rPr>
+                <w:rFonts w:ascii="Aptos" w:cs="Aptos" w:eastAsia="Aptos" w:hAnsi="Aptos"/>
+                <w:color w:val="1A1A1A"/>
+                <w:sz w:val="14"/>
+                <w:szCs w:val="14"/>
+              </w:rPr>
+              <w:t xml:space="preserve"> </w:t>
+            </w:r>
+          </w:p>
+        </w:tc>
+        <w:tc>
+          <w:tcPr>
+            <w:tcW w:type="dxa" w:w="620"/>
+            <w:tcBorders>
+              <w:top w:val="single" w:color="C7D2DA" w:sz="2"/>
+              <w:left w:val="single" w:color="C7D2DA" w:sz="2"/>
+              <w:bottom w:val="single" w:color="C7D2DA" w:sz="2"/>
+              <w:right w:val="single" w:color="C7D2DA" w:sz="2"/>
+            </w:tcBorders>
+            <w:shd w:fill="6B7B6F" w:color="auto" w:val="clear"/>
+            <w:tcMar>
+              <w:top w:type="dxa" w:w="0"/>
+              <w:left w:type="dxa" w:w="80"/>
+              <w:bottom w:type="dxa" w:w="0"/>
+              <w:right w:type="dxa" w:w="80"/>
+            </w:tcMar>
+            <w:vAlign w:val="center"/>
+          </w:tcPr>
+          <w:p>
+            <w:pPr>
+              <w:spacing w:after="60" w:before="60" w:line="240"/>
+              <w:jc w:val="left"/>
+            </w:pPr>
+            <w:r>
+              <w:rPr>
+                <w:rFonts w:ascii="Aptos" w:cs="Aptos" w:eastAsia="Aptos" w:hAnsi="Aptos"/>
+                <w:color w:val="1A1A1A"/>
+                <w:sz w:val="14"/>
+                <w:szCs w:val="14"/>
+              </w:rPr>
+              <w:t xml:space="preserve"> </w:t>
+            </w:r>
+          </w:p>
+        </w:tc>
+        <w:tc>
+          <w:tcPr>
+            <w:tcW w:type="dxa" w:w="620"/>
+            <w:tcBorders>
+              <w:top w:val="single" w:color="C7D2DA" w:sz="2"/>
+              <w:left w:val="single" w:color="C7D2DA" w:sz="2"/>
+              <w:bottom w:val="single" w:color="C7D2DA" w:sz="2"/>
+              <w:right w:val="single" w:color="C7D2DA" w:sz="2"/>
+            </w:tcBorders>
+            <w:shd w:fill="F7F9FB" w:color="auto" w:val="clear"/>
+            <w:tcMar>
+              <w:top w:type="dxa" w:w="0"/>
+              <w:left w:type="dxa" w:w="80"/>
+              <w:bottom w:type="dxa" w:w="0"/>
+              <w:right w:type="dxa" w:w="80"/>
+            </w:tcMar>
+            <w:vAlign w:val="center"/>
+          </w:tcPr>
+          <w:p>
+            <w:pPr>
+              <w:spacing w:after="60" w:before="60" w:line="240"/>
+              <w:jc w:val="left"/>
+            </w:pPr>
+            <w:r>
+              <w:rPr>
+                <w:rFonts w:ascii="Aptos" w:cs="Aptos" w:eastAsia="Aptos" w:hAnsi="Aptos"/>
+                <w:color w:val="1A1A1A"/>
+                <w:sz w:val="14"/>
+                <w:szCs w:val="14"/>
+              </w:rPr>
+              <w:t xml:space="preserve"> </w:t>
+            </w:r>
+          </w:p>
+        </w:tc>
+        <w:tc>
+          <w:tcPr>
+            <w:tcW w:type="dxa" w:w="620"/>
+            <w:tcBorders>
+              <w:top w:val="single" w:color="C7D2DA" w:sz="2"/>
+              <w:left w:val="single" w:color="C7D2DA" w:sz="2"/>
+              <w:bottom w:val="single" w:color="C7D2DA" w:sz="2"/>
+              <w:right w:val="single" w:color="C7D2DA" w:sz="2"/>
+            </w:tcBorders>
+            <w:shd w:fill="F7F9FB" w:color="auto" w:val="clear"/>
+            <w:tcMar>
+              <w:top w:type="dxa" w:w="0"/>
+              <w:left w:type="dxa" w:w="80"/>
+              <w:bottom w:type="dxa" w:w="0"/>
+              <w:right w:type="dxa" w:w="80"/>
+            </w:tcMar>
+            <w:vAlign w:val="center"/>
+          </w:tcPr>
+          <w:p>
+            <w:pPr>
+              <w:spacing w:after="60" w:before="60" w:line="240"/>
+              <w:jc w:val="left"/>
+            </w:pPr>
+            <w:r>
+              <w:rPr>
+                <w:rFonts w:ascii="Aptos" w:cs="Aptos" w:eastAsia="Aptos" w:hAnsi="Aptos"/>
+                <w:color w:val="1A1A1A"/>
+                <w:sz w:val="14"/>
+                <w:szCs w:val="14"/>
+              </w:rPr>
+              <w:t xml:space="preserve"> </w:t>
+            </w:r>
+          </w:p>
+        </w:tc>
+        <w:tc>
+          <w:tcPr>
+            <w:tcW w:type="dxa" w:w="620"/>
+            <w:tcBorders>
+              <w:top w:val="single" w:color="C7D2DA" w:sz="2"/>
+              <w:left w:val="single" w:color="C7D2DA" w:sz="2"/>
+              <w:bottom w:val="single" w:color="C7D2DA" w:sz="2"/>
+              <w:right w:val="single" w:color="C7D2DA" w:sz="2"/>
+            </w:tcBorders>
+            <w:shd w:fill="F7F9FB" w:color="auto" w:val="clear"/>
+            <w:tcMar>
+              <w:top w:type="dxa" w:w="0"/>
+              <w:left w:type="dxa" w:w="80"/>
+              <w:bottom w:type="dxa" w:w="0"/>
+              <w:right w:type="dxa" w:w="80"/>
+            </w:tcMar>
+            <w:vAlign w:val="center"/>
+          </w:tcPr>
+          <w:p>
+            <w:pPr>
+              <w:spacing w:after="60" w:before="60" w:line="240"/>
+              <w:jc w:val="left"/>
+            </w:pPr>
+            <w:r>
+              <w:rPr>
+                <w:rFonts w:ascii="Aptos" w:cs="Aptos" w:eastAsia="Aptos" w:hAnsi="Aptos"/>
+                <w:color w:val="1A1A1A"/>
+                <w:sz w:val="14"/>
+                <w:szCs w:val="14"/>
+              </w:rPr>
+              <w:t xml:space="preserve"> </w:t>
+            </w:r>
+          </w:p>
+        </w:tc>
+        <w:tc>
+          <w:tcPr>
+            <w:tcW w:type="dxa" w:w="620"/>
+            <w:tcBorders>
+              <w:top w:val="single" w:color="C7D2DA" w:sz="2"/>
+              <w:left w:val="single" w:color="C7D2DA" w:sz="2"/>
+              <w:bottom w:val="single" w:color="C7D2DA" w:sz="2"/>
+              <w:right w:val="single" w:color="C7D2DA" w:sz="2"/>
+            </w:tcBorders>
+            <w:shd w:fill="F7F9FB" w:color="auto" w:val="clear"/>
+            <w:tcMar>
+              <w:top w:type="dxa" w:w="0"/>
+              <w:left w:type="dxa" w:w="80"/>
+              <w:bottom w:type="dxa" w:w="0"/>
+              <w:right w:type="dxa" w:w="80"/>
+            </w:tcMar>
+            <w:vAlign w:val="center"/>
+          </w:tcPr>
+          <w:p>
+            <w:pPr>
+              <w:spacing w:after="60" w:before="60" w:line="240"/>
+              <w:jc w:val="left"/>
+            </w:pPr>
+            <w:r>
+              <w:rPr>
+                <w:rFonts w:ascii="Aptos" w:cs="Aptos" w:eastAsia="Aptos" w:hAnsi="Aptos"/>
+                <w:color w:val="1A1A1A"/>
+                <w:sz w:val="14"/>
+                <w:szCs w:val="14"/>
+              </w:rPr>
+              <w:t xml:space="preserve"> </w:t>
+            </w:r>
+          </w:p>
+        </w:tc>
+        <w:tc>
+          <w:tcPr>
+            <w:tcW w:type="dxa" w:w="620"/>
+            <w:tcBorders>
+              <w:top w:val="single" w:color="C7D2DA" w:sz="2"/>
+              <w:left w:val="single" w:color="C7D2DA" w:sz="2"/>
+              <w:bottom w:val="single" w:color="C7D2DA" w:sz="2"/>
+              <w:right w:val="single" w:color="C7D2DA" w:sz="2"/>
+            </w:tcBorders>
+            <w:shd w:fill="F7F9FB" w:color="auto" w:val="clear"/>
+            <w:tcMar>
+              <w:top w:type="dxa" w:w="0"/>
+              <w:left w:type="dxa" w:w="80"/>
+              <w:bottom w:type="dxa" w:w="0"/>
+              <w:right w:type="dxa" w:w="80"/>
+            </w:tcMar>
+            <w:vAlign w:val="center"/>
+          </w:tcPr>
+          <w:p>
+            <w:pPr>
+              <w:spacing w:after="60" w:before="60" w:line="240"/>
+              <w:jc w:val="left"/>
+            </w:pPr>
+            <w:r>
+              <w:rPr>
+                <w:rFonts w:ascii="Aptos" w:cs="Aptos" w:eastAsia="Aptos" w:hAnsi="Aptos"/>
+                <w:color w:val="1A1A1A"/>
+                <w:sz w:val="14"/>
+                <w:szCs w:val="14"/>
+              </w:rPr>
+              <w:t xml:space="preserve"> </w:t>
+            </w:r>
+          </w:p>
+        </w:tc>
+        <w:tc>
+          <w:tcPr>
+            <w:tcW w:type="dxa" w:w="620"/>
+            <w:tcBorders>
+              <w:top w:val="single" w:color="C7D2DA" w:sz="2"/>
+              <w:left w:val="single" w:color="C7D2DA" w:sz="2"/>
+              <w:bottom w:val="single" w:color="C7D2DA" w:sz="2"/>
+              <w:right w:val="single" w:color="C7D2DA" w:sz="2"/>
+            </w:tcBorders>
+            <w:shd w:fill="F7F9FB" w:color="auto" w:val="clear"/>
+            <w:tcMar>
+              <w:top w:type="dxa" w:w="0"/>
+              <w:left w:type="dxa" w:w="80"/>
+              <w:bottom w:type="dxa" w:w="0"/>
+              <w:right w:type="dxa" w:w="80"/>
+            </w:tcMar>
+            <w:vAlign w:val="center"/>
+          </w:tcPr>
+          <w:p>
+            <w:pPr>
+              <w:spacing w:after="60" w:before="60" w:line="240"/>
+              <w:jc w:val="left"/>
+            </w:pPr>
+            <w:r>
+              <w:rPr>
+                <w:rFonts w:ascii="Aptos" w:cs="Aptos" w:eastAsia="Aptos" w:hAnsi="Aptos"/>
+                <w:color w:val="1A1A1A"/>
+                <w:sz w:val="14"/>
+                <w:szCs w:val="14"/>
+              </w:rPr>
+              <w:t xml:space="preserve"> </w:t>
+            </w:r>
+          </w:p>
+        </w:tc>
+      </w:tr>
+      <w:tr>
+        <w:tc>
+          <w:tcPr>
+            <w:tcW w:type="dxa" w:w="1826"/>
+            <w:tcBorders>
+              <w:top w:val="single" w:color="C7D2DA" w:sz="2"/>
+              <w:left w:val="single" w:color="C7D2DA" w:sz="2"/>
+              <w:bottom w:val="single" w:color="C7D2DA" w:sz="2"/>
+              <w:right w:val="single" w:color="C7D2DA" w:sz="2"/>
+            </w:tcBorders>
+            <w:tcMar>
+              <w:top w:type="dxa" w:w="0"/>
+              <w:left w:type="dxa" w:w="80"/>
+              <w:bottom w:type="dxa" w:w="0"/>
+              <w:right w:type="dxa" w:w="80"/>
+            </w:tcMar>
+            <w:vAlign w:val="center"/>
+          </w:tcPr>
+          <w:p>
+            <w:pPr>
+              <w:spacing w:after="60" w:before="60" w:line="240"/>
+              <w:jc w:val="left"/>
+            </w:pPr>
+            <w:r>
+              <w:rPr>
+                <w:rFonts w:ascii="Aptos" w:cs="Aptos" w:eastAsia="Aptos" w:hAnsi="Aptos"/>
+                <w:b/>
+                <w:bCs/>
+                <w:color w:val="0B2A3D"/>
+                <w:sz w:val="15"/>
+                <w:szCs w:val="15"/>
+              </w:rPr>
+              <w:t xml:space="preserve">WS7, Decision-making ecosystem, automation and AI (cross-cutting)</w:t>
+            </w:r>
+          </w:p>
+        </w:tc>
+        <w:tc>
+          <w:tcPr>
+            <w:tcW w:type="dxa" w:w="1400"/>
+            <w:tcBorders>
+              <w:top w:val="single" w:color="C7D2DA" w:sz="2"/>
+              <w:left w:val="single" w:color="C7D2DA" w:sz="2"/>
+              <w:bottom w:val="single" w:color="C7D2DA" w:sz="2"/>
+              <w:right w:val="single" w:color="C7D2DA" w:sz="2"/>
+            </w:tcBorders>
+            <w:tcMar>
+              <w:top w:type="dxa" w:w="0"/>
+              <w:left w:type="dxa" w:w="80"/>
+              <w:bottom w:type="dxa" w:w="0"/>
+              <w:right w:type="dxa" w:w="80"/>
+            </w:tcMar>
+            <w:vAlign w:val="center"/>
+          </w:tcPr>
+          <w:p>
+            <w:pPr>
+              <w:spacing w:after="60" w:before="60" w:line="240"/>
+              <w:jc w:val="center"/>
+            </w:pPr>
+            <w:r>
+              <w:rPr>
+                <w:rFonts w:ascii="Aptos" w:cs="Aptos" w:eastAsia="Aptos" w:hAnsi="Aptos"/>
+                <w:color w:val="1A1A1A"/>
+                <w:sz w:val="14"/>
+                <w:szCs w:val="14"/>
+              </w:rPr>
               <w:t xml:space="preserve">15 Sep 2026</w:t>
             </w:r>
           </w:p>
@@ -5224,7 +6009,6 @@
               <w:bottom w:val="single" w:color="C7D2DA" w:sz="2"/>
               <w:right w:val="single" w:color="C7D2DA" w:sz="2"/>
             </w:tcBorders>
-            <w:shd w:fill="F7F9FB" w:color="auto" w:val="clear"/>
             <w:tcMar>
               <w:top w:type="dxa" w:w="0"/>
               <w:left w:type="dxa" w:w="80"/>
@@ -8321,7 +9105,7 @@
               <w:bottom w:val="single" w:color="C7D2DA" w:sz="2"/>
               <w:right w:val="single" w:color="C7D2DA" w:sz="2"/>
             </w:tcBorders>
-            <w:shd w:fill="1B6CA8" w:color="auto" w:val="clear"/>
+            <w:shd w:fill="C00000" w:color="auto" w:val="clear"/>
             <w:tcMar>
               <w:top w:type="dxa" w:w="0"/>
               <w:left w:type="dxa" w:w="80"/>
@@ -8344,7 +9128,7 @@
                 <w:sz w:val="16"/>
                 <w:szCs w:val="16"/>
               </w:rPr>
-              <w:t xml:space="preserve">WS3, Sector de-risking and financing framework  (01 Oct 2026 to 31 May 2027)</w:t>
+              <w:t xml:space="preserve">WS3, Quantification of losses to the Rwandan economy  (08 Sep 2026 to 15 Nov 2026)</w:t>
             </w:r>
           </w:p>
         </w:tc>
@@ -8414,7 +9198,7 @@
                 <w:sz w:val="15"/>
                 <w:szCs w:val="15"/>
               </w:rPr>
-              <w:t xml:space="preserve">Mapping, explanation and modelling of risks in the value chain</w:t>
+              <w:t xml:space="preserve">Definition of the loss taxonomy, historical period and data sources</w:t>
             </w:r>
           </w:p>
         </w:tc>
@@ -8482,7 +9266,7 @@
                 <w:sz w:val="14"/>
                 <w:szCs w:val="14"/>
               </w:rPr>
-              <w:t xml:space="preserve">30 Nov 2026 (D+90)</w:t>
+              <w:t xml:space="preserve">15 Oct 2026 (D+44)</w:t>
             </w:r>
           </w:p>
         </w:tc>
@@ -8515,7 +9299,7 @@
                 <w:sz w:val="14"/>
                 <w:szCs w:val="14"/>
               </w:rPr>
-              <w:t xml:space="preserve">61 days (~2 months)</w:t>
+              <w:t xml:space="preserve">38 days (~1 month)</w:t>
             </w:r>
           </w:p>
         </w:tc>
@@ -8587,7 +9371,7 @@
                 <w:sz w:val="15"/>
                 <w:szCs w:val="15"/>
               </w:rPr>
-              <w:t xml:space="preserve">Demonstration risk-pricing model</w:t>
+              <w:t xml:space="preserve">Demonstration loss-quantification model</w:t>
             </w:r>
           </w:p>
         </w:tc>
@@ -8657,7 +9441,7 @@
                 <w:sz w:val="14"/>
                 <w:szCs w:val="14"/>
               </w:rPr>
-              <w:t xml:space="preserve">30 Nov 2026 (D+90)</w:t>
+              <w:t xml:space="preserve">31 Oct 2026 (D+60)</w:t>
             </w:r>
           </w:p>
         </w:tc>
@@ -8691,7 +9475,7 @@
                 <w:sz w:val="14"/>
                 <w:szCs w:val="14"/>
               </w:rPr>
-              <w:t xml:space="preserve">47 days (~2 months)</w:t>
+              <w:t xml:space="preserve">54 days (~2 months)</w:t>
             </w:r>
           </w:p>
         </w:tc>
@@ -8761,7 +9545,7 @@
                 <w:sz w:val="15"/>
                 <w:szCs w:val="15"/>
               </w:rPr>
-              <w:t xml:space="preserve">Engagement with financial institutions around the model</w:t>
+              <w:t xml:space="preserve">Historical data population and computation</w:t>
             </w:r>
           </w:p>
         </w:tc>
@@ -8794,7 +9578,7 @@
                 <w:sz w:val="14"/>
                 <w:szCs w:val="14"/>
               </w:rPr>
-              <w:t xml:space="preserve">Mineral market intelligence expert, with the CEO's office</w:t>
+              <w:t xml:space="preserve">Mineral market intelligence expert</w:t>
             </w:r>
           </w:p>
         </w:tc>
@@ -8829,7 +9613,7 @@
                 <w:sz w:val="14"/>
                 <w:szCs w:val="14"/>
               </w:rPr>
-              <w:t xml:space="preserve">31 Mar 2027 (D+211)</w:t>
+              <w:t xml:space="preserve">07 Nov 2026 (D+67)</w:t>
             </w:r>
           </w:p>
         </w:tc>
@@ -8862,7 +9646,7 @@
                 <w:sz w:val="14"/>
                 <w:szCs w:val="14"/>
               </w:rPr>
-              <w:t xml:space="preserve">121 days (~4 months)</w:t>
+              <w:t xml:space="preserve">23 days</w:t>
             </w:r>
           </w:p>
         </w:tc>
@@ -8934,7 +9718,7 @@
                 <w:sz w:val="15"/>
                 <w:szCs w:val="15"/>
               </w:rPr>
-              <w:t xml:space="preserve">Mitigation and monitoring strategy with key risk indicators</w:t>
+              <w:t xml:space="preserve">Validation and sensitivity check</w:t>
             </w:r>
           </w:p>
         </w:tc>
@@ -9004,7 +9788,7 @@
                 <w:sz w:val="14"/>
                 <w:szCs w:val="14"/>
               </w:rPr>
-              <w:t xml:space="preserve">31 Mar 2027 (D+211)</w:t>
+              <w:t xml:space="preserve">15 Nov 2026 (D+75)</w:t>
             </w:r>
           </w:p>
         </w:tc>
@@ -9038,7 +9822,7 @@
                 <w:sz w:val="14"/>
                 <w:szCs w:val="14"/>
               </w:rPr>
-              <w:t xml:space="preserve">87 days (~3 months)</w:t>
+              <w:t xml:space="preserve">8 days</w:t>
             </w:r>
           </w:p>
         </w:tc>
@@ -9108,7 +9892,7 @@
                 <w:sz w:val="15"/>
                 <w:szCs w:val="15"/>
               </w:rPr>
-              <w:t xml:space="preserve">Financing options study</w:t>
+              <w:t xml:space="preserve">Explanatory note and Board presentation</w:t>
             </w:r>
           </w:p>
         </w:tc>
@@ -9176,7 +9960,7 @@
                 <w:sz w:val="14"/>
                 <w:szCs w:val="14"/>
               </w:rPr>
-              <w:t xml:space="preserve">30 Apr 2027 (D+241)</w:t>
+              <w:t xml:space="preserve">15 Nov 2026 (D+75)</w:t>
             </w:r>
           </w:p>
         </w:tc>
@@ -9209,7 +9993,7 @@
                 <w:sz w:val="14"/>
                 <w:szCs w:val="14"/>
               </w:rPr>
-              <w:t xml:space="preserve">89 days (~3 months)</w:t>
+              <w:t xml:space="preserve">8 days</w:t>
             </w:r>
           </w:p>
         </w:tc>
@@ -9217,6 +10001,45 @@
       <w:tr>
         <w:tc>
           <w:tcPr>
+            <w:tcW w:type="dxa" w:w="10206"/>
+            <w:gridSpan w:val="5"/>
+            <w:tcBorders>
+              <w:top w:val="single" w:color="C7D2DA" w:sz="2"/>
+              <w:left w:val="single" w:color="C7D2DA" w:sz="2"/>
+              <w:bottom w:val="single" w:color="C7D2DA" w:sz="2"/>
+              <w:right w:val="single" w:color="C7D2DA" w:sz="2"/>
+            </w:tcBorders>
+            <w:shd w:fill="1B6CA8" w:color="auto" w:val="clear"/>
+            <w:tcMar>
+              <w:top w:type="dxa" w:w="0"/>
+              <w:left w:type="dxa" w:w="80"/>
+              <w:bottom w:type="dxa" w:w="0"/>
+              <w:right w:type="dxa" w:w="80"/>
+            </w:tcMar>
+            <w:vAlign w:val="center"/>
+          </w:tcPr>
+          <w:p>
+            <w:pPr>
+              <w:spacing w:after="60" w:before="60" w:line="240"/>
+              <w:jc w:val="left"/>
+            </w:pPr>
+            <w:r>
+              <w:rPr>
+                <w:rFonts w:ascii="Aptos" w:cs="Aptos" w:eastAsia="Aptos" w:hAnsi="Aptos"/>
+                <w:b/>
+                <w:bCs/>
+                <w:color w:val="FFFFFF"/>
+                <w:sz w:val="16"/>
+                <w:szCs w:val="16"/>
+              </w:rPr>
+              <w:t xml:space="preserve">WS4, Sector de-risking and financing framework  (01 Oct 2026 to 31 May 2027)</w:t>
+            </w:r>
+          </w:p>
+        </w:tc>
+      </w:tr>
+      <w:tr>
+        <w:tc>
+          <w:tcPr>
             <w:tcW w:type="dxa" w:w="640"/>
             <w:tcBorders>
               <w:top w:val="single" w:color="C7D2DA" w:sz="2"/>
@@ -9224,7 +10047,6 @@
               <w:bottom w:val="single" w:color="C7D2DA" w:sz="2"/>
               <w:right w:val="single" w:color="C7D2DA" w:sz="2"/>
             </w:tcBorders>
-            <w:shd w:fill="F7F9FB" w:color="auto" w:val="clear"/>
             <w:tcMar>
               <w:top w:type="dxa" w:w="0"/>
               <w:left w:type="dxa" w:w="80"/>
@@ -9247,7 +10069,873 @@
                 <w:sz w:val="15"/>
                 <w:szCs w:val="15"/>
               </w:rPr>
-              <w:t xml:space="preserve">A3.6</w:t>
+              <w:t xml:space="preserve">A4.1</w:t>
+            </w:r>
+          </w:p>
+        </w:tc>
+        <w:tc>
+          <w:tcPr>
+            <w:tcW w:type="dxa" w:w="4166"/>
+            <w:tcBorders>
+              <w:top w:val="single" w:color="C7D2DA" w:sz="2"/>
+              <w:left w:val="single" w:color="C7D2DA" w:sz="2"/>
+              <w:bottom w:val="single" w:color="C7D2DA" w:sz="2"/>
+              <w:right w:val="single" w:color="C7D2DA" w:sz="2"/>
+            </w:tcBorders>
+            <w:tcMar>
+              <w:top w:type="dxa" w:w="0"/>
+              <w:left w:type="dxa" w:w="80"/>
+              <w:bottom w:type="dxa" w:w="0"/>
+              <w:right w:type="dxa" w:w="80"/>
+            </w:tcMar>
+            <w:vAlign w:val="center"/>
+          </w:tcPr>
+          <w:p>
+            <w:pPr>
+              <w:spacing w:after="60" w:before="60" w:line="240"/>
+              <w:jc w:val="left"/>
+            </w:pPr>
+            <w:r>
+              <w:rPr>
+                <w:rFonts w:ascii="Aptos" w:cs="Aptos" w:eastAsia="Aptos" w:hAnsi="Aptos"/>
+                <w:color w:val="1A1A1A"/>
+                <w:sz w:val="15"/>
+                <w:szCs w:val="15"/>
+              </w:rPr>
+              <w:t xml:space="preserve">Mapping, explanation and modelling of risks in the value chain</w:t>
+            </w:r>
+          </w:p>
+        </w:tc>
+        <w:tc>
+          <w:tcPr>
+            <w:tcW w:type="dxa" w:w="2200"/>
+            <w:tcBorders>
+              <w:top w:val="single" w:color="C7D2DA" w:sz="2"/>
+              <w:left w:val="single" w:color="C7D2DA" w:sz="2"/>
+              <w:bottom w:val="single" w:color="C7D2DA" w:sz="2"/>
+              <w:right w:val="single" w:color="C7D2DA" w:sz="2"/>
+            </w:tcBorders>
+            <w:tcMar>
+              <w:top w:type="dxa" w:w="0"/>
+              <w:left w:type="dxa" w:w="80"/>
+              <w:bottom w:type="dxa" w:w="0"/>
+              <w:right w:type="dxa" w:w="80"/>
+            </w:tcMar>
+            <w:vAlign w:val="center"/>
+          </w:tcPr>
+          <w:p>
+            <w:pPr>
+              <w:spacing w:after="60" w:before="60" w:line="240"/>
+              <w:jc w:val="both"/>
+            </w:pPr>
+            <w:r>
+              <w:rPr>
+                <w:rFonts w:ascii="Aptos" w:cs="Aptos" w:eastAsia="Aptos" w:hAnsi="Aptos"/>
+                <w:color w:val="1A1A1A"/>
+                <w:sz w:val="14"/>
+                <w:szCs w:val="14"/>
+              </w:rPr>
+              <w:t xml:space="preserve">Mineral market intelligence expert</w:t>
+            </w:r>
+          </w:p>
+        </w:tc>
+        <w:tc>
+          <w:tcPr>
+            <w:tcW w:type="dxa" w:w="1700"/>
+            <w:tcBorders>
+              <w:top w:val="single" w:color="C7D2DA" w:sz="2"/>
+              <w:left w:val="single" w:color="C7D2DA" w:sz="2"/>
+              <w:bottom w:val="single" w:color="C7D2DA" w:sz="2"/>
+              <w:right w:val="single" w:color="C7D2DA" w:sz="2"/>
+            </w:tcBorders>
+            <w:tcMar>
+              <w:top w:type="dxa" w:w="0"/>
+              <w:left w:type="dxa" w:w="80"/>
+              <w:bottom w:type="dxa" w:w="0"/>
+              <w:right w:type="dxa" w:w="80"/>
+            </w:tcMar>
+            <w:vAlign w:val="center"/>
+          </w:tcPr>
+          <w:p>
+            <w:pPr>
+              <w:spacing w:after="60" w:before="60" w:line="240"/>
+              <w:jc w:val="center"/>
+            </w:pPr>
+            <w:r>
+              <w:rPr>
+                <w:rFonts w:ascii="Aptos" w:cs="Aptos" w:eastAsia="Aptos" w:hAnsi="Aptos"/>
+                <w:b/>
+                <w:bCs/>
+                <w:color w:val="0B2A3D"/>
+                <w:sz w:val="14"/>
+                <w:szCs w:val="14"/>
+              </w:rPr>
+              <w:t xml:space="preserve">30 Nov 2026 (D+90)</w:t>
+            </w:r>
+          </w:p>
+        </w:tc>
+        <w:tc>
+          <w:tcPr>
+            <w:tcW w:type="dxa" w:w="1500"/>
+            <w:tcBorders>
+              <w:top w:val="single" w:color="C7D2DA" w:sz="2"/>
+              <w:left w:val="single" w:color="C7D2DA" w:sz="2"/>
+              <w:bottom w:val="single" w:color="C7D2DA" w:sz="2"/>
+              <w:right w:val="single" w:color="C7D2DA" w:sz="2"/>
+            </w:tcBorders>
+            <w:tcMar>
+              <w:top w:type="dxa" w:w="0"/>
+              <w:left w:type="dxa" w:w="80"/>
+              <w:bottom w:type="dxa" w:w="0"/>
+              <w:right w:type="dxa" w:w="80"/>
+            </w:tcMar>
+            <w:vAlign w:val="center"/>
+          </w:tcPr>
+          <w:p>
+            <w:pPr>
+              <w:spacing w:after="60" w:before="60" w:line="240"/>
+              <w:jc w:val="center"/>
+            </w:pPr>
+            <w:r>
+              <w:rPr>
+                <w:rFonts w:ascii="Aptos" w:cs="Aptos" w:eastAsia="Aptos" w:hAnsi="Aptos"/>
+                <w:color w:val="1A1A1A"/>
+                <w:sz w:val="14"/>
+                <w:szCs w:val="14"/>
+              </w:rPr>
+              <w:t xml:space="preserve">61 days (~2 months)</w:t>
+            </w:r>
+          </w:p>
+        </w:tc>
+      </w:tr>
+      <w:tr>
+        <w:tc>
+          <w:tcPr>
+            <w:tcW w:type="dxa" w:w="640"/>
+            <w:tcBorders>
+              <w:top w:val="single" w:color="C7D2DA" w:sz="2"/>
+              <w:left w:val="single" w:color="C7D2DA" w:sz="2"/>
+              <w:bottom w:val="single" w:color="C7D2DA" w:sz="2"/>
+              <w:right w:val="single" w:color="C7D2DA" w:sz="2"/>
+            </w:tcBorders>
+            <w:shd w:fill="F7F9FB" w:color="auto" w:val="clear"/>
+            <w:tcMar>
+              <w:top w:type="dxa" w:w="0"/>
+              <w:left w:type="dxa" w:w="80"/>
+              <w:bottom w:type="dxa" w:w="0"/>
+              <w:right w:type="dxa" w:w="80"/>
+            </w:tcMar>
+            <w:vAlign w:val="center"/>
+          </w:tcPr>
+          <w:p>
+            <w:pPr>
+              <w:spacing w:after="60" w:before="60" w:line="240"/>
+              <w:jc w:val="center"/>
+            </w:pPr>
+            <w:r>
+              <w:rPr>
+                <w:rFonts w:ascii="Aptos" w:cs="Aptos" w:eastAsia="Aptos" w:hAnsi="Aptos"/>
+                <w:b/>
+                <w:bCs/>
+                <w:color w:val="0B2A3D"/>
+                <w:sz w:val="15"/>
+                <w:szCs w:val="15"/>
+              </w:rPr>
+              <w:t xml:space="preserve">A4.2</w:t>
+            </w:r>
+          </w:p>
+        </w:tc>
+        <w:tc>
+          <w:tcPr>
+            <w:tcW w:type="dxa" w:w="4166"/>
+            <w:tcBorders>
+              <w:top w:val="single" w:color="C7D2DA" w:sz="2"/>
+              <w:left w:val="single" w:color="C7D2DA" w:sz="2"/>
+              <w:bottom w:val="single" w:color="C7D2DA" w:sz="2"/>
+              <w:right w:val="single" w:color="C7D2DA" w:sz="2"/>
+            </w:tcBorders>
+            <w:shd w:fill="F7F9FB" w:color="auto" w:val="clear"/>
+            <w:tcMar>
+              <w:top w:type="dxa" w:w="0"/>
+              <w:left w:type="dxa" w:w="80"/>
+              <w:bottom w:type="dxa" w:w="0"/>
+              <w:right w:type="dxa" w:w="80"/>
+            </w:tcMar>
+            <w:vAlign w:val="center"/>
+          </w:tcPr>
+          <w:p>
+            <w:pPr>
+              <w:spacing w:after="60" w:before="60" w:line="240"/>
+              <w:jc w:val="left"/>
+            </w:pPr>
+            <w:r>
+              <w:rPr>
+                <w:rFonts w:ascii="Aptos" w:cs="Aptos" w:eastAsia="Aptos" w:hAnsi="Aptos"/>
+                <w:color w:val="1A1A1A"/>
+                <w:sz w:val="15"/>
+                <w:szCs w:val="15"/>
+              </w:rPr>
+              <w:t xml:space="preserve">Demonstration risk-pricing model</w:t>
+            </w:r>
+          </w:p>
+        </w:tc>
+        <w:tc>
+          <w:tcPr>
+            <w:tcW w:type="dxa" w:w="2200"/>
+            <w:tcBorders>
+              <w:top w:val="single" w:color="C7D2DA" w:sz="2"/>
+              <w:left w:val="single" w:color="C7D2DA" w:sz="2"/>
+              <w:bottom w:val="single" w:color="C7D2DA" w:sz="2"/>
+              <w:right w:val="single" w:color="C7D2DA" w:sz="2"/>
+            </w:tcBorders>
+            <w:shd w:fill="F7F9FB" w:color="auto" w:val="clear"/>
+            <w:tcMar>
+              <w:top w:type="dxa" w:w="0"/>
+              <w:left w:type="dxa" w:w="80"/>
+              <w:bottom w:type="dxa" w:w="0"/>
+              <w:right w:type="dxa" w:w="80"/>
+            </w:tcMar>
+            <w:vAlign w:val="center"/>
+          </w:tcPr>
+          <w:p>
+            <w:pPr>
+              <w:spacing w:after="60" w:before="60" w:line="240"/>
+              <w:jc w:val="both"/>
+            </w:pPr>
+            <w:r>
+              <w:rPr>
+                <w:rFonts w:ascii="Aptos" w:cs="Aptos" w:eastAsia="Aptos" w:hAnsi="Aptos"/>
+                <w:color w:val="1A1A1A"/>
+                <w:sz w:val="14"/>
+                <w:szCs w:val="14"/>
+              </w:rPr>
+              <w:t xml:space="preserve">Mineral market intelligence expert</w:t>
+            </w:r>
+          </w:p>
+        </w:tc>
+        <w:tc>
+          <w:tcPr>
+            <w:tcW w:type="dxa" w:w="1700"/>
+            <w:tcBorders>
+              <w:top w:val="single" w:color="C7D2DA" w:sz="2"/>
+              <w:left w:val="single" w:color="C7D2DA" w:sz="2"/>
+              <w:bottom w:val="single" w:color="C7D2DA" w:sz="2"/>
+              <w:right w:val="single" w:color="C7D2DA" w:sz="2"/>
+            </w:tcBorders>
+            <w:shd w:fill="F7F9FB" w:color="auto" w:val="clear"/>
+            <w:tcMar>
+              <w:top w:type="dxa" w:w="0"/>
+              <w:left w:type="dxa" w:w="80"/>
+              <w:bottom w:type="dxa" w:w="0"/>
+              <w:right w:type="dxa" w:w="80"/>
+            </w:tcMar>
+            <w:vAlign w:val="center"/>
+          </w:tcPr>
+          <w:p>
+            <w:pPr>
+              <w:spacing w:after="60" w:before="60" w:line="240"/>
+              <w:jc w:val="center"/>
+            </w:pPr>
+            <w:r>
+              <w:rPr>
+                <w:rFonts w:ascii="Aptos" w:cs="Aptos" w:eastAsia="Aptos" w:hAnsi="Aptos"/>
+                <w:b/>
+                <w:bCs/>
+                <w:color w:val="0B2A3D"/>
+                <w:sz w:val="14"/>
+                <w:szCs w:val="14"/>
+              </w:rPr>
+              <w:t xml:space="preserve">30 Nov 2026 (D+90)</w:t>
+            </w:r>
+          </w:p>
+        </w:tc>
+        <w:tc>
+          <w:tcPr>
+            <w:tcW w:type="dxa" w:w="1500"/>
+            <w:tcBorders>
+              <w:top w:val="single" w:color="C7D2DA" w:sz="2"/>
+              <w:left w:val="single" w:color="C7D2DA" w:sz="2"/>
+              <w:bottom w:val="single" w:color="C7D2DA" w:sz="2"/>
+              <w:right w:val="single" w:color="C7D2DA" w:sz="2"/>
+            </w:tcBorders>
+            <w:shd w:fill="F7F9FB" w:color="auto" w:val="clear"/>
+            <w:tcMar>
+              <w:top w:type="dxa" w:w="0"/>
+              <w:left w:type="dxa" w:w="80"/>
+              <w:bottom w:type="dxa" w:w="0"/>
+              <w:right w:type="dxa" w:w="80"/>
+            </w:tcMar>
+            <w:vAlign w:val="center"/>
+          </w:tcPr>
+          <w:p>
+            <w:pPr>
+              <w:spacing w:after="60" w:before="60" w:line="240"/>
+              <w:jc w:val="center"/>
+            </w:pPr>
+            <w:r>
+              <w:rPr>
+                <w:rFonts w:ascii="Aptos" w:cs="Aptos" w:eastAsia="Aptos" w:hAnsi="Aptos"/>
+                <w:color w:val="1A1A1A"/>
+                <w:sz w:val="14"/>
+                <w:szCs w:val="14"/>
+              </w:rPr>
+              <w:t xml:space="preserve">47 days (~2 months)</w:t>
+            </w:r>
+          </w:p>
+        </w:tc>
+      </w:tr>
+      <w:tr>
+        <w:tc>
+          <w:tcPr>
+            <w:tcW w:type="dxa" w:w="640"/>
+            <w:tcBorders>
+              <w:top w:val="single" w:color="C7D2DA" w:sz="2"/>
+              <w:left w:val="single" w:color="C7D2DA" w:sz="2"/>
+              <w:bottom w:val="single" w:color="C7D2DA" w:sz="2"/>
+              <w:right w:val="single" w:color="C7D2DA" w:sz="2"/>
+            </w:tcBorders>
+            <w:tcMar>
+              <w:top w:type="dxa" w:w="0"/>
+              <w:left w:type="dxa" w:w="80"/>
+              <w:bottom w:type="dxa" w:w="0"/>
+              <w:right w:type="dxa" w:w="80"/>
+            </w:tcMar>
+            <w:vAlign w:val="center"/>
+          </w:tcPr>
+          <w:p>
+            <w:pPr>
+              <w:spacing w:after="60" w:before="60" w:line="240"/>
+              <w:jc w:val="center"/>
+            </w:pPr>
+            <w:r>
+              <w:rPr>
+                <w:rFonts w:ascii="Aptos" w:cs="Aptos" w:eastAsia="Aptos" w:hAnsi="Aptos"/>
+                <w:b/>
+                <w:bCs/>
+                <w:color w:val="0B2A3D"/>
+                <w:sz w:val="15"/>
+                <w:szCs w:val="15"/>
+              </w:rPr>
+              <w:t xml:space="preserve">A4.3</w:t>
+            </w:r>
+          </w:p>
+        </w:tc>
+        <w:tc>
+          <w:tcPr>
+            <w:tcW w:type="dxa" w:w="4166"/>
+            <w:tcBorders>
+              <w:top w:val="single" w:color="C7D2DA" w:sz="2"/>
+              <w:left w:val="single" w:color="C7D2DA" w:sz="2"/>
+              <w:bottom w:val="single" w:color="C7D2DA" w:sz="2"/>
+              <w:right w:val="single" w:color="C7D2DA" w:sz="2"/>
+            </w:tcBorders>
+            <w:tcMar>
+              <w:top w:type="dxa" w:w="0"/>
+              <w:left w:type="dxa" w:w="80"/>
+              <w:bottom w:type="dxa" w:w="0"/>
+              <w:right w:type="dxa" w:w="80"/>
+            </w:tcMar>
+            <w:vAlign w:val="center"/>
+          </w:tcPr>
+          <w:p>
+            <w:pPr>
+              <w:spacing w:after="60" w:before="60" w:line="240"/>
+              <w:jc w:val="left"/>
+            </w:pPr>
+            <w:r>
+              <w:rPr>
+                <w:rFonts w:ascii="Aptos" w:cs="Aptos" w:eastAsia="Aptos" w:hAnsi="Aptos"/>
+                <w:color w:val="1A1A1A"/>
+                <w:sz w:val="15"/>
+                <w:szCs w:val="15"/>
+              </w:rPr>
+              <w:t xml:space="preserve">Engagement with financial institutions around the model</w:t>
+            </w:r>
+          </w:p>
+        </w:tc>
+        <w:tc>
+          <w:tcPr>
+            <w:tcW w:type="dxa" w:w="2200"/>
+            <w:tcBorders>
+              <w:top w:val="single" w:color="C7D2DA" w:sz="2"/>
+              <w:left w:val="single" w:color="C7D2DA" w:sz="2"/>
+              <w:bottom w:val="single" w:color="C7D2DA" w:sz="2"/>
+              <w:right w:val="single" w:color="C7D2DA" w:sz="2"/>
+            </w:tcBorders>
+            <w:tcMar>
+              <w:top w:type="dxa" w:w="0"/>
+              <w:left w:type="dxa" w:w="80"/>
+              <w:bottom w:type="dxa" w:w="0"/>
+              <w:right w:type="dxa" w:w="80"/>
+            </w:tcMar>
+            <w:vAlign w:val="center"/>
+          </w:tcPr>
+          <w:p>
+            <w:pPr>
+              <w:spacing w:after="60" w:before="60" w:line="240"/>
+              <w:jc w:val="both"/>
+            </w:pPr>
+            <w:r>
+              <w:rPr>
+                <w:rFonts w:ascii="Aptos" w:cs="Aptos" w:eastAsia="Aptos" w:hAnsi="Aptos"/>
+                <w:color w:val="1A1A1A"/>
+                <w:sz w:val="14"/>
+                <w:szCs w:val="14"/>
+              </w:rPr>
+              <w:t xml:space="preserve">Mineral market intelligence expert, with the CEO's office</w:t>
+            </w:r>
+          </w:p>
+        </w:tc>
+        <w:tc>
+          <w:tcPr>
+            <w:tcW w:type="dxa" w:w="1700"/>
+            <w:tcBorders>
+              <w:top w:val="single" w:color="C7D2DA" w:sz="2"/>
+              <w:left w:val="single" w:color="C7D2DA" w:sz="2"/>
+              <w:bottom w:val="single" w:color="C7D2DA" w:sz="2"/>
+              <w:right w:val="single" w:color="C7D2DA" w:sz="2"/>
+            </w:tcBorders>
+            <w:tcMar>
+              <w:top w:type="dxa" w:w="0"/>
+              <w:left w:type="dxa" w:w="80"/>
+              <w:bottom w:type="dxa" w:w="0"/>
+              <w:right w:type="dxa" w:w="80"/>
+            </w:tcMar>
+            <w:vAlign w:val="center"/>
+          </w:tcPr>
+          <w:p>
+            <w:pPr>
+              <w:spacing w:after="60" w:before="60" w:line="240"/>
+              <w:jc w:val="center"/>
+            </w:pPr>
+            <w:r>
+              <w:rPr>
+                <w:rFonts w:ascii="Aptos" w:cs="Aptos" w:eastAsia="Aptos" w:hAnsi="Aptos"/>
+                <w:b/>
+                <w:bCs/>
+                <w:color w:val="0B2A3D"/>
+                <w:sz w:val="14"/>
+                <w:szCs w:val="14"/>
+              </w:rPr>
+              <w:t xml:space="preserve">31 Mar 2027 (D+211)</w:t>
+            </w:r>
+          </w:p>
+        </w:tc>
+        <w:tc>
+          <w:tcPr>
+            <w:tcW w:type="dxa" w:w="1500"/>
+            <w:tcBorders>
+              <w:top w:val="single" w:color="C7D2DA" w:sz="2"/>
+              <w:left w:val="single" w:color="C7D2DA" w:sz="2"/>
+              <w:bottom w:val="single" w:color="C7D2DA" w:sz="2"/>
+              <w:right w:val="single" w:color="C7D2DA" w:sz="2"/>
+            </w:tcBorders>
+            <w:tcMar>
+              <w:top w:type="dxa" w:w="0"/>
+              <w:left w:type="dxa" w:w="80"/>
+              <w:bottom w:type="dxa" w:w="0"/>
+              <w:right w:type="dxa" w:w="80"/>
+            </w:tcMar>
+            <w:vAlign w:val="center"/>
+          </w:tcPr>
+          <w:p>
+            <w:pPr>
+              <w:spacing w:after="60" w:before="60" w:line="240"/>
+              <w:jc w:val="center"/>
+            </w:pPr>
+            <w:r>
+              <w:rPr>
+                <w:rFonts w:ascii="Aptos" w:cs="Aptos" w:eastAsia="Aptos" w:hAnsi="Aptos"/>
+                <w:color w:val="1A1A1A"/>
+                <w:sz w:val="14"/>
+                <w:szCs w:val="14"/>
+              </w:rPr>
+              <w:t xml:space="preserve">121 days (~4 months)</w:t>
+            </w:r>
+          </w:p>
+        </w:tc>
+      </w:tr>
+      <w:tr>
+        <w:tc>
+          <w:tcPr>
+            <w:tcW w:type="dxa" w:w="640"/>
+            <w:tcBorders>
+              <w:top w:val="single" w:color="C7D2DA" w:sz="2"/>
+              <w:left w:val="single" w:color="C7D2DA" w:sz="2"/>
+              <w:bottom w:val="single" w:color="C7D2DA" w:sz="2"/>
+              <w:right w:val="single" w:color="C7D2DA" w:sz="2"/>
+            </w:tcBorders>
+            <w:shd w:fill="F7F9FB" w:color="auto" w:val="clear"/>
+            <w:tcMar>
+              <w:top w:type="dxa" w:w="0"/>
+              <w:left w:type="dxa" w:w="80"/>
+              <w:bottom w:type="dxa" w:w="0"/>
+              <w:right w:type="dxa" w:w="80"/>
+            </w:tcMar>
+            <w:vAlign w:val="center"/>
+          </w:tcPr>
+          <w:p>
+            <w:pPr>
+              <w:spacing w:after="60" w:before="60" w:line="240"/>
+              <w:jc w:val="center"/>
+            </w:pPr>
+            <w:r>
+              <w:rPr>
+                <w:rFonts w:ascii="Aptos" w:cs="Aptos" w:eastAsia="Aptos" w:hAnsi="Aptos"/>
+                <w:b/>
+                <w:bCs/>
+                <w:color w:val="0B2A3D"/>
+                <w:sz w:val="15"/>
+                <w:szCs w:val="15"/>
+              </w:rPr>
+              <w:t xml:space="preserve">A4.4</w:t>
+            </w:r>
+          </w:p>
+        </w:tc>
+        <w:tc>
+          <w:tcPr>
+            <w:tcW w:type="dxa" w:w="4166"/>
+            <w:tcBorders>
+              <w:top w:val="single" w:color="C7D2DA" w:sz="2"/>
+              <w:left w:val="single" w:color="C7D2DA" w:sz="2"/>
+              <w:bottom w:val="single" w:color="C7D2DA" w:sz="2"/>
+              <w:right w:val="single" w:color="C7D2DA" w:sz="2"/>
+            </w:tcBorders>
+            <w:shd w:fill="F7F9FB" w:color="auto" w:val="clear"/>
+            <w:tcMar>
+              <w:top w:type="dxa" w:w="0"/>
+              <w:left w:type="dxa" w:w="80"/>
+              <w:bottom w:type="dxa" w:w="0"/>
+              <w:right w:type="dxa" w:w="80"/>
+            </w:tcMar>
+            <w:vAlign w:val="center"/>
+          </w:tcPr>
+          <w:p>
+            <w:pPr>
+              <w:spacing w:after="60" w:before="60" w:line="240"/>
+              <w:jc w:val="left"/>
+            </w:pPr>
+            <w:r>
+              <w:rPr>
+                <w:rFonts w:ascii="Aptos" w:cs="Aptos" w:eastAsia="Aptos" w:hAnsi="Aptos"/>
+                <w:color w:val="1A1A1A"/>
+                <w:sz w:val="15"/>
+                <w:szCs w:val="15"/>
+              </w:rPr>
+              <w:t xml:space="preserve">Mitigation and monitoring strategy with key risk indicators</w:t>
+            </w:r>
+          </w:p>
+        </w:tc>
+        <w:tc>
+          <w:tcPr>
+            <w:tcW w:type="dxa" w:w="2200"/>
+            <w:tcBorders>
+              <w:top w:val="single" w:color="C7D2DA" w:sz="2"/>
+              <w:left w:val="single" w:color="C7D2DA" w:sz="2"/>
+              <w:bottom w:val="single" w:color="C7D2DA" w:sz="2"/>
+              <w:right w:val="single" w:color="C7D2DA" w:sz="2"/>
+            </w:tcBorders>
+            <w:shd w:fill="F7F9FB" w:color="auto" w:val="clear"/>
+            <w:tcMar>
+              <w:top w:type="dxa" w:w="0"/>
+              <w:left w:type="dxa" w:w="80"/>
+              <w:bottom w:type="dxa" w:w="0"/>
+              <w:right w:type="dxa" w:w="80"/>
+            </w:tcMar>
+            <w:vAlign w:val="center"/>
+          </w:tcPr>
+          <w:p>
+            <w:pPr>
+              <w:spacing w:after="60" w:before="60" w:line="240"/>
+              <w:jc w:val="both"/>
+            </w:pPr>
+            <w:r>
+              <w:rPr>
+                <w:rFonts w:ascii="Aptos" w:cs="Aptos" w:eastAsia="Aptos" w:hAnsi="Aptos"/>
+                <w:color w:val="1A1A1A"/>
+                <w:sz w:val="14"/>
+                <w:szCs w:val="14"/>
+              </w:rPr>
+              <w:t xml:space="preserve">Mineral market intelligence expert</w:t>
+            </w:r>
+          </w:p>
+        </w:tc>
+        <w:tc>
+          <w:tcPr>
+            <w:tcW w:type="dxa" w:w="1700"/>
+            <w:tcBorders>
+              <w:top w:val="single" w:color="C7D2DA" w:sz="2"/>
+              <w:left w:val="single" w:color="C7D2DA" w:sz="2"/>
+              <w:bottom w:val="single" w:color="C7D2DA" w:sz="2"/>
+              <w:right w:val="single" w:color="C7D2DA" w:sz="2"/>
+            </w:tcBorders>
+            <w:shd w:fill="F7F9FB" w:color="auto" w:val="clear"/>
+            <w:tcMar>
+              <w:top w:type="dxa" w:w="0"/>
+              <w:left w:type="dxa" w:w="80"/>
+              <w:bottom w:type="dxa" w:w="0"/>
+              <w:right w:type="dxa" w:w="80"/>
+            </w:tcMar>
+            <w:vAlign w:val="center"/>
+          </w:tcPr>
+          <w:p>
+            <w:pPr>
+              <w:spacing w:after="60" w:before="60" w:line="240"/>
+              <w:jc w:val="center"/>
+            </w:pPr>
+            <w:r>
+              <w:rPr>
+                <w:rFonts w:ascii="Aptos" w:cs="Aptos" w:eastAsia="Aptos" w:hAnsi="Aptos"/>
+                <w:b/>
+                <w:bCs/>
+                <w:color w:val="0B2A3D"/>
+                <w:sz w:val="14"/>
+                <w:szCs w:val="14"/>
+              </w:rPr>
+              <w:t xml:space="preserve">31 Mar 2027 (D+211)</w:t>
+            </w:r>
+          </w:p>
+        </w:tc>
+        <w:tc>
+          <w:tcPr>
+            <w:tcW w:type="dxa" w:w="1500"/>
+            <w:tcBorders>
+              <w:top w:val="single" w:color="C7D2DA" w:sz="2"/>
+              <w:left w:val="single" w:color="C7D2DA" w:sz="2"/>
+              <w:bottom w:val="single" w:color="C7D2DA" w:sz="2"/>
+              <w:right w:val="single" w:color="C7D2DA" w:sz="2"/>
+            </w:tcBorders>
+            <w:shd w:fill="F7F9FB" w:color="auto" w:val="clear"/>
+            <w:tcMar>
+              <w:top w:type="dxa" w:w="0"/>
+              <w:left w:type="dxa" w:w="80"/>
+              <w:bottom w:type="dxa" w:w="0"/>
+              <w:right w:type="dxa" w:w="80"/>
+            </w:tcMar>
+            <w:vAlign w:val="center"/>
+          </w:tcPr>
+          <w:p>
+            <w:pPr>
+              <w:spacing w:after="60" w:before="60" w:line="240"/>
+              <w:jc w:val="center"/>
+            </w:pPr>
+            <w:r>
+              <w:rPr>
+                <w:rFonts w:ascii="Aptos" w:cs="Aptos" w:eastAsia="Aptos" w:hAnsi="Aptos"/>
+                <w:color w:val="1A1A1A"/>
+                <w:sz w:val="14"/>
+                <w:szCs w:val="14"/>
+              </w:rPr>
+              <w:t xml:space="preserve">87 days (~3 months)</w:t>
+            </w:r>
+          </w:p>
+        </w:tc>
+      </w:tr>
+      <w:tr>
+        <w:tc>
+          <w:tcPr>
+            <w:tcW w:type="dxa" w:w="640"/>
+            <w:tcBorders>
+              <w:top w:val="single" w:color="C7D2DA" w:sz="2"/>
+              <w:left w:val="single" w:color="C7D2DA" w:sz="2"/>
+              <w:bottom w:val="single" w:color="C7D2DA" w:sz="2"/>
+              <w:right w:val="single" w:color="C7D2DA" w:sz="2"/>
+            </w:tcBorders>
+            <w:tcMar>
+              <w:top w:type="dxa" w:w="0"/>
+              <w:left w:type="dxa" w:w="80"/>
+              <w:bottom w:type="dxa" w:w="0"/>
+              <w:right w:type="dxa" w:w="80"/>
+            </w:tcMar>
+            <w:vAlign w:val="center"/>
+          </w:tcPr>
+          <w:p>
+            <w:pPr>
+              <w:spacing w:after="60" w:before="60" w:line="240"/>
+              <w:jc w:val="center"/>
+            </w:pPr>
+            <w:r>
+              <w:rPr>
+                <w:rFonts w:ascii="Aptos" w:cs="Aptos" w:eastAsia="Aptos" w:hAnsi="Aptos"/>
+                <w:b/>
+                <w:bCs/>
+                <w:color w:val="0B2A3D"/>
+                <w:sz w:val="15"/>
+                <w:szCs w:val="15"/>
+              </w:rPr>
+              <w:t xml:space="preserve">A4.5</w:t>
+            </w:r>
+          </w:p>
+        </w:tc>
+        <w:tc>
+          <w:tcPr>
+            <w:tcW w:type="dxa" w:w="4166"/>
+            <w:tcBorders>
+              <w:top w:val="single" w:color="C7D2DA" w:sz="2"/>
+              <w:left w:val="single" w:color="C7D2DA" w:sz="2"/>
+              <w:bottom w:val="single" w:color="C7D2DA" w:sz="2"/>
+              <w:right w:val="single" w:color="C7D2DA" w:sz="2"/>
+            </w:tcBorders>
+            <w:tcMar>
+              <w:top w:type="dxa" w:w="0"/>
+              <w:left w:type="dxa" w:w="80"/>
+              <w:bottom w:type="dxa" w:w="0"/>
+              <w:right w:type="dxa" w:w="80"/>
+            </w:tcMar>
+            <w:vAlign w:val="center"/>
+          </w:tcPr>
+          <w:p>
+            <w:pPr>
+              <w:spacing w:after="60" w:before="60" w:line="240"/>
+              <w:jc w:val="left"/>
+            </w:pPr>
+            <w:r>
+              <w:rPr>
+                <w:rFonts w:ascii="Aptos" w:cs="Aptos" w:eastAsia="Aptos" w:hAnsi="Aptos"/>
+                <w:color w:val="1A1A1A"/>
+                <w:sz w:val="15"/>
+                <w:szCs w:val="15"/>
+              </w:rPr>
+              <w:t xml:space="preserve">Financing options study</w:t>
+            </w:r>
+          </w:p>
+        </w:tc>
+        <w:tc>
+          <w:tcPr>
+            <w:tcW w:type="dxa" w:w="2200"/>
+            <w:tcBorders>
+              <w:top w:val="single" w:color="C7D2DA" w:sz="2"/>
+              <w:left w:val="single" w:color="C7D2DA" w:sz="2"/>
+              <w:bottom w:val="single" w:color="C7D2DA" w:sz="2"/>
+              <w:right w:val="single" w:color="C7D2DA" w:sz="2"/>
+            </w:tcBorders>
+            <w:tcMar>
+              <w:top w:type="dxa" w:w="0"/>
+              <w:left w:type="dxa" w:w="80"/>
+              <w:bottom w:type="dxa" w:w="0"/>
+              <w:right w:type="dxa" w:w="80"/>
+            </w:tcMar>
+            <w:vAlign w:val="center"/>
+          </w:tcPr>
+          <w:p>
+            <w:pPr>
+              <w:spacing w:after="60" w:before="60" w:line="240"/>
+              <w:jc w:val="both"/>
+            </w:pPr>
+            <w:r>
+              <w:rPr>
+                <w:rFonts w:ascii="Aptos" w:cs="Aptos" w:eastAsia="Aptos" w:hAnsi="Aptos"/>
+                <w:color w:val="1A1A1A"/>
+                <w:sz w:val="14"/>
+                <w:szCs w:val="14"/>
+              </w:rPr>
+              <w:t xml:space="preserve">Mineral market intelligence expert</w:t>
+            </w:r>
+          </w:p>
+        </w:tc>
+        <w:tc>
+          <w:tcPr>
+            <w:tcW w:type="dxa" w:w="1700"/>
+            <w:tcBorders>
+              <w:top w:val="single" w:color="C7D2DA" w:sz="2"/>
+              <w:left w:val="single" w:color="C7D2DA" w:sz="2"/>
+              <w:bottom w:val="single" w:color="C7D2DA" w:sz="2"/>
+              <w:right w:val="single" w:color="C7D2DA" w:sz="2"/>
+            </w:tcBorders>
+            <w:tcMar>
+              <w:top w:type="dxa" w:w="0"/>
+              <w:left w:type="dxa" w:w="80"/>
+              <w:bottom w:type="dxa" w:w="0"/>
+              <w:right w:type="dxa" w:w="80"/>
+            </w:tcMar>
+            <w:vAlign w:val="center"/>
+          </w:tcPr>
+          <w:p>
+            <w:pPr>
+              <w:spacing w:after="60" w:before="60" w:line="240"/>
+              <w:jc w:val="center"/>
+            </w:pPr>
+            <w:r>
+              <w:rPr>
+                <w:rFonts w:ascii="Aptos" w:cs="Aptos" w:eastAsia="Aptos" w:hAnsi="Aptos"/>
+                <w:b/>
+                <w:bCs/>
+                <w:color w:val="0B2A3D"/>
+                <w:sz w:val="14"/>
+                <w:szCs w:val="14"/>
+              </w:rPr>
+              <w:t xml:space="preserve">30 Apr 2027 (D+241)</w:t>
+            </w:r>
+          </w:p>
+        </w:tc>
+        <w:tc>
+          <w:tcPr>
+            <w:tcW w:type="dxa" w:w="1500"/>
+            <w:tcBorders>
+              <w:top w:val="single" w:color="C7D2DA" w:sz="2"/>
+              <w:left w:val="single" w:color="C7D2DA" w:sz="2"/>
+              <w:bottom w:val="single" w:color="C7D2DA" w:sz="2"/>
+              <w:right w:val="single" w:color="C7D2DA" w:sz="2"/>
+            </w:tcBorders>
+            <w:tcMar>
+              <w:top w:type="dxa" w:w="0"/>
+              <w:left w:type="dxa" w:w="80"/>
+              <w:bottom w:type="dxa" w:w="0"/>
+              <w:right w:type="dxa" w:w="80"/>
+            </w:tcMar>
+            <w:vAlign w:val="center"/>
+          </w:tcPr>
+          <w:p>
+            <w:pPr>
+              <w:spacing w:after="60" w:before="60" w:line="240"/>
+              <w:jc w:val="center"/>
+            </w:pPr>
+            <w:r>
+              <w:rPr>
+                <w:rFonts w:ascii="Aptos" w:cs="Aptos" w:eastAsia="Aptos" w:hAnsi="Aptos"/>
+                <w:color w:val="1A1A1A"/>
+                <w:sz w:val="14"/>
+                <w:szCs w:val="14"/>
+              </w:rPr>
+              <w:t xml:space="preserve">89 days (~3 months)</w:t>
+            </w:r>
+          </w:p>
+        </w:tc>
+      </w:tr>
+      <w:tr>
+        <w:tc>
+          <w:tcPr>
+            <w:tcW w:type="dxa" w:w="640"/>
+            <w:tcBorders>
+              <w:top w:val="single" w:color="C7D2DA" w:sz="2"/>
+              <w:left w:val="single" w:color="C7D2DA" w:sz="2"/>
+              <w:bottom w:val="single" w:color="C7D2DA" w:sz="2"/>
+              <w:right w:val="single" w:color="C7D2DA" w:sz="2"/>
+            </w:tcBorders>
+            <w:shd w:fill="F7F9FB" w:color="auto" w:val="clear"/>
+            <w:tcMar>
+              <w:top w:type="dxa" w:w="0"/>
+              <w:left w:type="dxa" w:w="80"/>
+              <w:bottom w:type="dxa" w:w="0"/>
+              <w:right w:type="dxa" w:w="80"/>
+            </w:tcMar>
+            <w:vAlign w:val="center"/>
+          </w:tcPr>
+          <w:p>
+            <w:pPr>
+              <w:spacing w:after="60" w:before="60" w:line="240"/>
+              <w:jc w:val="center"/>
+            </w:pPr>
+            <w:r>
+              <w:rPr>
+                <w:rFonts w:ascii="Aptos" w:cs="Aptos" w:eastAsia="Aptos" w:hAnsi="Aptos"/>
+                <w:b/>
+                <w:bCs/>
+                <w:color w:val="0B2A3D"/>
+                <w:sz w:val="15"/>
+                <w:szCs w:val="15"/>
+              </w:rPr>
+              <w:t xml:space="preserve">A4.6</w:t>
             </w:r>
           </w:p>
         </w:tc>
@@ -9424,7 +11112,7 @@
                 <w:sz w:val="16"/>
                 <w:szCs w:val="16"/>
               </w:rPr>
-              <w:t xml:space="preserve">WS4, Prices predictability for processing-plant investors  (01 Nov 2026 to 31 May 2027)</w:t>
+              <w:t xml:space="preserve">WS5, Prices predictability for processing-plant investors  (01 Nov 2026 to 31 May 2027)</w:t>
             </w:r>
           </w:p>
         </w:tc>
@@ -9461,7 +11149,7 @@
                 <w:sz w:val="15"/>
                 <w:szCs w:val="15"/>
               </w:rPr>
-              <w:t xml:space="preserve">A4.1</w:t>
+              <w:t xml:space="preserve">A5.1</w:t>
             </w:r>
           </w:p>
         </w:tc>
@@ -9633,7 +11321,7 @@
                 <w:sz w:val="15"/>
                 <w:szCs w:val="15"/>
               </w:rPr>
-              <w:t xml:space="preserve">A4.2</w:t>
+              <w:t xml:space="preserve">A5.2</w:t>
             </w:r>
           </w:p>
         </w:tc>
@@ -9808,7 +11496,7 @@
                 <w:sz w:val="15"/>
                 <w:szCs w:val="15"/>
               </w:rPr>
-              <w:t xml:space="preserve">A4.3</w:t>
+              <w:t xml:space="preserve">A5.3</w:t>
             </w:r>
           </w:p>
         </w:tc>
@@ -9980,7 +11668,7 @@
                 <w:sz w:val="15"/>
                 <w:szCs w:val="15"/>
               </w:rPr>
-              <w:t xml:space="preserve">A4.4</w:t>
+              <w:t xml:space="preserve">A5.4</w:t>
             </w:r>
           </w:p>
         </w:tc>
@@ -10155,7 +11843,7 @@
                 <w:sz w:val="15"/>
                 <w:szCs w:val="15"/>
               </w:rPr>
-              <w:t xml:space="preserve">A4.5</w:t>
+              <w:t xml:space="preserve">A5.5</w:t>
             </w:r>
           </w:p>
         </w:tc>
@@ -10327,7 +12015,7 @@
                 <w:sz w:val="15"/>
                 <w:szCs w:val="15"/>
               </w:rPr>
-              <w:t xml:space="preserve">A4.6</w:t>
+              <w:t xml:space="preserve">A5.6</w:t>
             </w:r>
           </w:p>
         </w:tc>
@@ -10502,7 +12190,7 @@
                 <w:sz w:val="15"/>
                 <w:szCs w:val="15"/>
               </w:rPr>
-              <w:t xml:space="preserve">A4.7</w:t>
+              <w:t xml:space="preserve">A5.7</w:t>
             </w:r>
           </w:p>
         </w:tc>
@@ -10675,7 +12363,7 @@
                 <w:sz w:val="16"/>
                 <w:szCs w:val="16"/>
               </w:rPr>
-              <w:t xml:space="preserve">WS5, Programme mobilisation and governance  (05 Sep 2026 to 30 Nov 2026)</w:t>
+              <w:t xml:space="preserve">WS6, Programme mobilisation and governance  (05 Sep 2026 to 30 Nov 2026)</w:t>
             </w:r>
           </w:p>
         </w:tc>
@@ -10712,7 +12400,7 @@
                 <w:sz w:val="15"/>
                 <w:szCs w:val="15"/>
               </w:rPr>
-              <w:t xml:space="preserve">A5.1</w:t>
+              <w:t xml:space="preserve">A6.1</w:t>
             </w:r>
           </w:p>
         </w:tc>
@@ -10884,7 +12572,7 @@
                 <w:sz w:val="15"/>
                 <w:szCs w:val="15"/>
               </w:rPr>
-              <w:t xml:space="preserve">A5.2</w:t>
+              <w:t xml:space="preserve">A6.2</w:t>
             </w:r>
           </w:p>
         </w:tc>
@@ -11059,7 +12747,7 @@
                 <w:sz w:val="15"/>
                 <w:szCs w:val="15"/>
               </w:rPr>
-              <w:t xml:space="preserve">A5.3</w:t>
+              <w:t xml:space="preserve">A6.3</w:t>
             </w:r>
           </w:p>
         </w:tc>
@@ -11231,7 +12919,7 @@
                 <w:sz w:val="15"/>
                 <w:szCs w:val="15"/>
               </w:rPr>
-              <w:t xml:space="preserve">A5.4</w:t>
+              <w:t xml:space="preserve">A6.4</w:t>
             </w:r>
           </w:p>
         </w:tc>
@@ -11408,7 +13096,7 @@
                 <w:sz w:val="16"/>
                 <w:szCs w:val="16"/>
               </w:rPr>
-              <w:t xml:space="preserve">WS6, Decision-making ecosystem, automation and AI (cross-cutting)  (15 Sep 2026 to 31 May 2027)</w:t>
+              <w:t xml:space="preserve">WS7, Decision-making ecosystem, automation and AI (cross-cutting)  (15 Sep 2026 to 31 May 2027)</w:t>
             </w:r>
           </w:p>
         </w:tc>
@@ -11445,7 +13133,7 @@
                 <w:sz w:val="15"/>
                 <w:szCs w:val="15"/>
               </w:rPr>
-              <w:t xml:space="preserve">A6.1</w:t>
+              <w:t xml:space="preserve">A7.1</w:t>
             </w:r>
           </w:p>
         </w:tc>
@@ -11617,7 +13305,7 @@
                 <w:sz w:val="15"/>
                 <w:szCs w:val="15"/>
               </w:rPr>
-              <w:t xml:space="preserve">A6.2</w:t>
+              <w:t xml:space="preserve">A7.2</w:t>
             </w:r>
           </w:p>
         </w:tc>
@@ -11792,7 +13480,7 @@
                 <w:sz w:val="15"/>
                 <w:szCs w:val="15"/>
               </w:rPr>
-              <w:t xml:space="preserve">A6.3</w:t>
+              <w:t xml:space="preserve">A7.3</w:t>
             </w:r>
           </w:p>
         </w:tc>
@@ -11964,7 +13652,7 @@
                 <w:sz w:val="15"/>
                 <w:szCs w:val="15"/>
               </w:rPr>
-              <w:t xml:space="preserve">A6.4</w:t>
+              <w:t xml:space="preserve">A7.4</w:t>
             </w:r>
           </w:p>
         </w:tc>
@@ -12139,7 +13827,7 @@
                 <w:sz w:val="15"/>
                 <w:szCs w:val="15"/>
               </w:rPr>
-              <w:t xml:space="preserve">A6.5</w:t>
+              <w:t xml:space="preserve">A7.5</w:t>
             </w:r>
           </w:p>
         </w:tc>
@@ -13533,6 +15221,15 @@
           <w:sz w:val="15"/>
           <w:szCs w:val="15"/>
         </w:rPr>
+        <w:t xml:space="preserve">WS7 Workstream 7;  </w:t>
+      </w:r>
+      <w:r>
+        <w:rPr>
+          <w:rFonts w:ascii="Aptos" w:cs="Aptos" w:eastAsia="Aptos" w:hAnsi="Aptos"/>
+          <w:color w:val="6B7A87"/>
+          <w:sz w:val="15"/>
+          <w:szCs w:val="15"/>
+        </w:rPr>
         <w:t xml:space="preserve">SO1 Specific objective 1;  </w:t>
       </w:r>
       <w:r>
@@ -13570,6 +15267,24 @@
           <w:szCs w:val="15"/>
         </w:rPr>
         <w:t xml:space="preserve">SO5 Specific objective 5;  </w:t>
+      </w:r>
+      <w:r>
+        <w:rPr>
+          <w:rFonts w:ascii="Aptos" w:cs="Aptos" w:eastAsia="Aptos" w:hAnsi="Aptos"/>
+          <w:color w:val="6B7A87"/>
+          <w:sz w:val="15"/>
+          <w:szCs w:val="15"/>
+        </w:rPr>
+        <w:t xml:space="preserve">SO6 Specific objective 6;  </w:t>
+      </w:r>
+      <w:r>
+        <w:rPr>
+          <w:rFonts w:ascii="Aptos" w:cs="Aptos" w:eastAsia="Aptos" w:hAnsi="Aptos"/>
+          <w:color w:val="6B7A87"/>
+          <w:sz w:val="15"/>
+          <w:szCs w:val="15"/>
+        </w:rPr>
+        <w:t xml:space="preserve">TC Treatment charge;  </w:t>
       </w:r>
       <w:r>
         <w:rPr>

</xml_diff>

<commit_message>
V5: correct request 3 - add profit reinvestment
V5: correct requirement 3, add profit-reinvestment tracking
</commit_message>
<xml_diff>
--- a/docs/RMB__BoD-2026-09-01_Action-plan_condensed.docx
+++ b/docs/RMB__BoD-2026-09-01_Action-plan_condensed.docx
@@ -133,7 +133,7 @@
                 <w:sz w:val="19"/>
                 <w:szCs w:val="19"/>
               </w:rPr>
-              <w:t xml:space="preserve">Six requirements came out of the meeting. Four of them depend on the same missing capability: RMB does not today see, systematically and in time, what is happening inside the companies it regulates. That capability is therefore built first, and the rest is sequenced around it. Six deliverables, including three working demonstrations built without budget, are ready for the Board meeting of early December 2026.</w:t>
+              <w:t xml:space="preserve">Six requirements came out of the meeting. Four of them depend on the same missing capability: RMB does not today see, systematically and in time, what is happening inside the companies it regulates. That capability is therefore built first, and the rest is sequenced around it. Seven deliverables, including three working demonstrations built without budget, are ready for the Board meeting of early December 2026.</w:t>
             </w:r>
           </w:p>
           <w:p>
@@ -621,7 +621,7 @@
                 <w:sz w:val="17"/>
                 <w:szCs w:val="17"/>
               </w:rPr>
-              <w:t xml:space="preserve">Calculating more accurately the losses undergone by the Rwandan economy</w:t>
+              <w:t xml:space="preserve">A more complete and realistic estimate of losses to the Rwandan economy</w:t>
             </w:r>
           </w:p>
           <w:p>
@@ -670,7 +670,7 @@
                 <w:sz w:val="16"/>
                 <w:szCs w:val="16"/>
               </w:rPr>
-              <w:t xml:space="preserve">WS3 builds a demonstration loss-quantification model covering the four categories the Board identified, populated with real contracts, invoices and assay reports over a historical period to be confirmed, with realistic, clearly flagged assumptions wherever a data gap requires one. A working model and a first defensible estimate, presented as a range rather than a false-precision figure, are ready by 15 November 2026 (D+75), ahead of the December Board meeting.</w:t>
+              <w:t xml:space="preserve">WS3 corrects this by quantifying all four loss categories, not prefinancing interest alone, and ranking them so the largest and most addressable component is visible rather than buried in a single combined figure. It also models the reverse question the Board raised: what the sector could gain by taking control of its own financing, rather than only measuring what has been lost. A working model and a first defensible range, ready by 15 November 2026 (D+75), ahead of the December Board meeting.</w:t>
             </w:r>
           </w:p>
         </w:tc>
@@ -1074,6 +1074,37 @@
           <w:szCs w:val="17"/>
         </w:rPr>
         <w:t xml:space="preserve">The Chair proposed State shareholding as the route to company information. This plan proposes reaching the same result, more completely and with equal treatment of every operator, through reporting obligations the law already allows, consistently enforced. Rather than take a position, an options paper compares shareholding, reporting and a hybrid on explicit criteria and leaves the arbitration to the Board (activity A1.3, 15 November 2026, D+75).</w:t>
+      </w:r>
+    </w:p>
+    <w:p>
+      <w:pPr>
+        <w:spacing w:after="60" w:before="0"/>
+      </w:pPr>
+    </w:p>
+    <w:p>
+      <w:pPr>
+        <w:spacing w:after="120" w:before="0" w:line="240"/>
+        <w:jc w:val="both"/>
+      </w:pPr>
+      <w:r>
+        <w:rPr>
+          <w:rFonts w:ascii="Aptos" w:cs="Aptos" w:eastAsia="Aptos" w:hAnsi="Aptos"/>
+          <w:b/>
+          <w:bCs/>
+          <w:color w:val="1A1A1A"/>
+          <w:sz w:val="17"/>
+          <w:szCs w:val="17"/>
+        </w:rPr>
+        <w:t xml:space="preserve">Note on requirement 3.  </w:t>
+      </w:r>
+      <w:r>
+        <w:rPr>
+          <w:rFonts w:ascii="Aptos" w:cs="Aptos" w:eastAsia="Aptos" w:hAnsi="Aptos"/>
+          <w:color w:val="1A1A1A"/>
+          <w:sz w:val="17"/>
+          <w:szCs w:val="17"/>
+        </w:rPr>
+        <w:t xml:space="preserve">The Board noted that the loss figures already presented were understated, since the estimate in circulation covered prefinancing interest alone. WS3 corrects this by quantifying all four categories the Board named, ranked by size, and adds the reverse question the Board raised: what the sector could gain by controlling its own financing.</w:t>
       </w:r>
     </w:p>
     <w:p>
@@ -1557,7 +1588,7 @@
                 <w:sz w:val="16"/>
                 <w:szCs w:val="16"/>
               </w:rPr>
-              <w:t xml:space="preserve">Produce a defensible, evidence-based estimate of what the Rwandan economy has lost in mineral trading transactions over the defined historical period, broken down into payability, penalty, unpriced-content and prefinancing-interest losses, so the scale of the problem is measured rather than assumed.</w:t>
+              <w:t xml:space="preserve">Correct the previously understated estimate of what the Rwandan economy has lost in mineral trading transactions by quantifying all four loss categories rather than prefinancing interest alone, and build the sector's first indicative picture of how much of its profit is being reinvested locally rather than exiting the sector, so RMB can act on evidence rather than on tax receipts alone.</w:t>
             </w:r>
           </w:p>
         </w:tc>
@@ -1592,7 +1623,7 @@
                 <w:sz w:val="16"/>
                 <w:szCs w:val="16"/>
               </w:rPr>
-              <w:t xml:space="preserve">15 Nov 2026 (D+75)</w:t>
+              <w:t xml:space="preserve">30 Nov 2026 (D+90)</w:t>
             </w:r>
           </w:p>
         </w:tc>
@@ -2539,7 +2570,7 @@
                 <w:sz w:val="17"/>
                 <w:szCs w:val="17"/>
               </w:rPr>
-              <w:t xml:space="preserve">Loss quantification model and first estimate</w:t>
+              <w:t xml:space="preserve">Loss and gain model: a corrected, complete estimate</w:t>
             </w:r>
           </w:p>
           <w:p>
@@ -2590,7 +2621,7 @@
                 <w:sz w:val="16"/>
                 <w:szCs w:val="16"/>
               </w:rPr>
-              <w:t xml:space="preserve">A working model, in the same Streamlit style as the other demonstrations, that computes what the Rwandan economy has lost in mineral trading transactions across the four categories the Board named: payability, unexplained penalties, unpriced by-product content, and prefinancing interest. Populated with real contracts, invoices and assay reports over the historical period, with assumptions flagged wherever data is incomplete, and presented as a range rather than a single false-precision number.</w:t>
+              <w:t xml:space="preserve">A working model, in the same Streamlit style as the other demonstrations, that corrects the earlier estimate presented to the Board, which covered prefinancing interest alone. It computes losses across all four categories the Board named, payability, unexplained penalties, unpriced by-product content, and prefinancing interest, ranked so the largest and most addressable component is visible, and models the reverse case: what the sector could gain from local control of its financing. Populated with real contracts, invoices and assay reports over the historical period, with assumptions flagged wherever data is incomplete, and presented as a range rather than a single false-precision number.</w:t>
             </w:r>
           </w:p>
         </w:tc>
@@ -2663,7 +2694,7 @@
                 <w:sz w:val="17"/>
                 <w:szCs w:val="17"/>
               </w:rPr>
-              <w:t xml:space="preserve">Risk map and risk-pricing model</w:t>
+              <w:t xml:space="preserve">Indicative profit-and-reinvestment estimate</w:t>
             </w:r>
           </w:p>
           <w:p>
@@ -2680,7 +2711,7 @@
                 <w:sz w:val="14"/>
                 <w:szCs w:val="14"/>
               </w:rPr>
-              <w:t xml:space="preserve">A4.1, A4.2</w:t>
+              <w:t xml:space="preserve">A3.6, A3.7</w:t>
             </w:r>
           </w:p>
         </w:tc>
@@ -2713,7 +2744,7 @@
                 <w:sz w:val="16"/>
                 <w:szCs w:val="16"/>
               </w:rPr>
-              <w:t xml:space="preserve">The sector's risks mapped, explained and modelled, covering financial risks and non-financial risks that carry a financial impact, with a demonstration model that prices them. Built to be run live with banks, insurers and BNR as the basis of a conversation about financing the sector rather than avoiding it.</w:t>
+              <w:t xml:space="preserve">An additional, RMB-initiated analysis, not raised by the Board, added because it changes how the loss and gain figures should be read. Mineral prices have risen sharply since 2024, and RMB's own visibility into the sector's finances stops at tax collected, which captures only a small share of the value passing through it. This analysis gives a first, clearly labelled indicative picture of how much of that price increase appears reinvested in the sector, new or upgraded processing capacity, equipment, employment, and how much cannot be traced. It also sets out the reporting fields that would make this visible on an ongoing basis rather than reconstructed after the fact.</w:t>
             </w:r>
           </w:p>
         </w:tc>
@@ -2786,7 +2817,7 @@
                 <w:sz w:val="17"/>
                 <w:szCs w:val="17"/>
               </w:rPr>
-              <w:t xml:space="preserve">Mapping of mineral trading companies</w:t>
+              <w:t xml:space="preserve">Risk map and risk-pricing model</w:t>
             </w:r>
           </w:p>
           <w:p>
@@ -2803,7 +2834,7 @@
                 <w:sz w:val="14"/>
                 <w:szCs w:val="14"/>
               </w:rPr>
-              <w:t xml:space="preserve">A2.2</w:t>
+              <w:t xml:space="preserve">A4.1, A4.2</w:t>
             </w:r>
           </w:p>
         </w:tc>
@@ -2837,6 +2868,129 @@
                 <w:sz w:val="16"/>
                 <w:szCs w:val="16"/>
               </w:rPr>
+              <w:t xml:space="preserve">The sector's risks mapped, explained and modelled, covering financial risks and non-financial risks that carry a financial impact, with a demonstration model that prices them. Built to be run live with banks, insurers and BNR as the basis of a conversation about financing the sector rather than avoiding it.</w:t>
+            </w:r>
+          </w:p>
+        </w:tc>
+        <w:tc>
+          <w:tcPr>
+            <w:tcW w:type="dxa" w:w="1700"/>
+            <w:tcBorders>
+              <w:top w:val="single" w:color="C7D2DA" w:sz="2"/>
+              <w:left w:val="single" w:color="C7D2DA" w:sz="2"/>
+              <w:bottom w:val="single" w:color="C7D2DA" w:sz="2"/>
+              <w:right w:val="single" w:color="C7D2DA" w:sz="2"/>
+            </w:tcBorders>
+            <w:shd w:fill="F7F9FB" w:color="auto" w:val="clear"/>
+            <w:tcMar>
+              <w:top w:type="dxa" w:w="0"/>
+              <w:left w:type="dxa" w:w="80"/>
+              <w:bottom w:type="dxa" w:w="0"/>
+              <w:right w:type="dxa" w:w="80"/>
+            </w:tcMar>
+            <w:vAlign w:val="center"/>
+          </w:tcPr>
+          <w:p>
+            <w:pPr>
+              <w:spacing w:after="60" w:before="60" w:line="240"/>
+              <w:jc w:val="center"/>
+            </w:pPr>
+            <w:r>
+              <w:rPr>
+                <w:rFonts w:ascii="Aptos" w:cs="Aptos" w:eastAsia="Aptos" w:hAnsi="Aptos"/>
+                <w:b/>
+                <w:bCs/>
+                <w:color w:val="0B2A3D"/>
+                <w:sz w:val="16"/>
+                <w:szCs w:val="16"/>
+              </w:rPr>
+              <w:t xml:space="preserve">30 Nov 2026 (D+90)</w:t>
+            </w:r>
+          </w:p>
+        </w:tc>
+      </w:tr>
+      <w:tr>
+        <w:tc>
+          <w:tcPr>
+            <w:tcW w:type="dxa" w:w="2700"/>
+            <w:tcBorders>
+              <w:top w:val="single" w:color="C7D2DA" w:sz="2"/>
+              <w:left w:val="single" w:color="C7D2DA" w:sz="2"/>
+              <w:bottom w:val="single" w:color="C7D2DA" w:sz="2"/>
+              <w:right w:val="single" w:color="C7D2DA" w:sz="2"/>
+            </w:tcBorders>
+            <w:tcMar>
+              <w:top w:type="dxa" w:w="0"/>
+              <w:left w:type="dxa" w:w="80"/>
+              <w:bottom w:type="dxa" w:w="0"/>
+              <w:right w:type="dxa" w:w="80"/>
+            </w:tcMar>
+            <w:vAlign w:val="center"/>
+          </w:tcPr>
+          <w:p>
+            <w:pPr>
+              <w:spacing w:after="16" w:before="60" w:line="240"/>
+              <w:jc w:val="left"/>
+            </w:pPr>
+            <w:r>
+              <w:rPr>
+                <w:rFonts w:ascii="Aptos" w:cs="Aptos" w:eastAsia="Aptos" w:hAnsi="Aptos"/>
+                <w:b/>
+                <w:bCs/>
+                <w:color w:val="0B2A3D"/>
+                <w:sz w:val="17"/>
+                <w:szCs w:val="17"/>
+              </w:rPr>
+              <w:t xml:space="preserve">Mapping of mineral trading companies</w:t>
+            </w:r>
+          </w:p>
+          <w:p>
+            <w:pPr>
+              <w:spacing w:after="60" w:before="0" w:line="240"/>
+              <w:jc w:val="left"/>
+            </w:pPr>
+            <w:r>
+              <w:rPr>
+                <w:rFonts w:ascii="Aptos" w:cs="Aptos" w:eastAsia="Aptos" w:hAnsi="Aptos"/>
+                <w:i/>
+                <w:iCs/>
+                <w:color w:val="6B7A87"/>
+                <w:sz w:val="14"/>
+                <w:szCs w:val="14"/>
+              </w:rPr>
+              <w:t xml:space="preserve">A2.2</w:t>
+            </w:r>
+          </w:p>
+        </w:tc>
+        <w:tc>
+          <w:tcPr>
+            <w:tcW w:type="dxa" w:w="5806"/>
+            <w:tcBorders>
+              <w:top w:val="single" w:color="C7D2DA" w:sz="2"/>
+              <w:left w:val="single" w:color="C7D2DA" w:sz="2"/>
+              <w:bottom w:val="single" w:color="C7D2DA" w:sz="2"/>
+              <w:right w:val="single" w:color="C7D2DA" w:sz="2"/>
+            </w:tcBorders>
+            <w:tcMar>
+              <w:top w:type="dxa" w:w="0"/>
+              <w:left w:type="dxa" w:w="80"/>
+              <w:bottom w:type="dxa" w:w="0"/>
+              <w:right w:type="dxa" w:w="80"/>
+            </w:tcMar>
+            <w:vAlign w:val="center"/>
+          </w:tcPr>
+          <w:p>
+            <w:pPr>
+              <w:spacing w:after="60" w:before="60" w:line="240"/>
+              <w:jc w:val="both"/>
+            </w:pPr>
+            <w:r>
+              <w:rPr>
+                <w:rFonts w:ascii="Aptos" w:cs="Aptos" w:eastAsia="Aptos" w:hAnsi="Aptos"/>
+                <w:color w:val="1A1A1A"/>
+                <w:sz w:val="16"/>
+                <w:szCs w:val="16"/>
+              </w:rPr>
               <w:t xml:space="preserve">Every licensed mineral trading company classified by activity level, by cash-flow movement (cash in against cash out) and by compliance with mandatory reporting, so that dormant and near-dormant holders are identified and reminded of their obligations before any revocation is considered.</w:t>
             </w:r>
           </w:p>
@@ -2850,7 +3004,6 @@
               <w:bottom w:val="single" w:color="C7D2DA" w:sz="2"/>
               <w:right w:val="single" w:color="C7D2DA" w:sz="2"/>
             </w:tcBorders>
-            <w:shd w:fill="F7F9FB" w:color="auto" w:val="clear"/>
             <w:tcMar>
               <w:top w:type="dxa" w:w="0"/>
               <w:left w:type="dxa" w:w="80"/>
@@ -2953,6 +3106,37 @@
         </w:tc>
       </w:tr>
     </w:tbl>
+    <w:p>
+      <w:pPr>
+        <w:spacing w:after="60" w:before="0"/>
+      </w:pPr>
+    </w:p>
+    <w:p>
+      <w:pPr>
+        <w:spacing w:after="120" w:before="0" w:line="240"/>
+        <w:jc w:val="both"/>
+      </w:pPr>
+      <w:r>
+        <w:rPr>
+          <w:rFonts w:ascii="Aptos" w:cs="Aptos" w:eastAsia="Aptos" w:hAnsi="Aptos"/>
+          <w:b/>
+          <w:bCs/>
+          <w:color w:val="1A1A1A"/>
+          <w:sz w:val="17"/>
+          <w:szCs w:val="17"/>
+        </w:rPr>
+        <w:t xml:space="preserve">One of these was not raised by the Board.  </w:t>
+      </w:r>
+      <w:r>
+        <w:rPr>
+          <w:rFonts w:ascii="Aptos" w:cs="Aptos" w:eastAsia="Aptos" w:hAnsi="Aptos"/>
+          <w:color w:val="1A1A1A"/>
+          <w:sz w:val="17"/>
+          <w:szCs w:val="17"/>
+        </w:rPr>
+        <w:t xml:space="preserve">The indicative profit-and-reinvestment estimate is an RMB-initiated addition, included because RMB's visibility into the sector's finances stops at tax collected (around five per cent of value in the best case), and because prices have risen sharply since 2024 without a visible matching increase in local processing capacity.</w:t>
+      </w:r>
+    </w:p>
     <w:p>
       <w:pPr>
         <w:spacing w:after="180" w:before="0"/>
@@ -4313,7 +4497,7 @@
                 <w:sz w:val="15"/>
                 <w:szCs w:val="15"/>
               </w:rPr>
-              <w:t xml:space="preserve">WS3, Quantification of losses to the Rwandan economy</w:t>
+              <w:t xml:space="preserve">WS3, Quantification of losses and profit reinvestment</w:t>
             </w:r>
           </w:p>
         </w:tc>
@@ -4381,7 +4565,7 @@
                 <w:sz w:val="14"/>
                 <w:szCs w:val="14"/>
               </w:rPr>
-              <w:t xml:space="preserve">15 Nov 2026</w:t>
+              <w:t xml:space="preserve">30 Nov 2026</w:t>
             </w:r>
           </w:p>
         </w:tc>
@@ -9128,7 +9312,7 @@
                 <w:sz w:val="16"/>
                 <w:szCs w:val="16"/>
               </w:rPr>
-              <w:t xml:space="preserve">WS3, Quantification of losses to the Rwandan economy  (08 Sep 2026 to 15 Nov 2026)</w:t>
+              <w:t xml:space="preserve">WS3, Quantification of losses and profit reinvestment  (08 Sep 2026 to 30 Nov 2026)</w:t>
             </w:r>
           </w:p>
         </w:tc>
@@ -9371,7 +9555,7 @@
                 <w:sz w:val="15"/>
                 <w:szCs w:val="15"/>
               </w:rPr>
-              <w:t xml:space="preserve">Demonstration loss-quantification model</w:t>
+              <w:t xml:space="preserve">Demonstration loss-and-gain model</w:t>
             </w:r>
           </w:p>
         </w:tc>
@@ -9994,6 +10178,353 @@
                 <w:szCs w:val="14"/>
               </w:rPr>
               <w:t xml:space="preserve">8 days</w:t>
+            </w:r>
+          </w:p>
+        </w:tc>
+      </w:tr>
+      <w:tr>
+        <w:tc>
+          <w:tcPr>
+            <w:tcW w:type="dxa" w:w="640"/>
+            <w:tcBorders>
+              <w:top w:val="single" w:color="C7D2DA" w:sz="2"/>
+              <w:left w:val="single" w:color="C7D2DA" w:sz="2"/>
+              <w:bottom w:val="single" w:color="C7D2DA" w:sz="2"/>
+              <w:right w:val="single" w:color="C7D2DA" w:sz="2"/>
+            </w:tcBorders>
+            <w:shd w:fill="F7F9FB" w:color="auto" w:val="clear"/>
+            <w:tcMar>
+              <w:top w:type="dxa" w:w="0"/>
+              <w:left w:type="dxa" w:w="80"/>
+              <w:bottom w:type="dxa" w:w="0"/>
+              <w:right w:type="dxa" w:w="80"/>
+            </w:tcMar>
+            <w:vAlign w:val="center"/>
+          </w:tcPr>
+          <w:p>
+            <w:pPr>
+              <w:spacing w:after="60" w:before="60" w:line="240"/>
+              <w:jc w:val="center"/>
+            </w:pPr>
+            <w:r>
+              <w:rPr>
+                <w:rFonts w:ascii="Aptos" w:cs="Aptos" w:eastAsia="Aptos" w:hAnsi="Aptos"/>
+                <w:b/>
+                <w:bCs/>
+                <w:color w:val="0B2A3D"/>
+                <w:sz w:val="15"/>
+                <w:szCs w:val="15"/>
+              </w:rPr>
+              <w:t xml:space="preserve">A3.6</w:t>
+            </w:r>
+          </w:p>
+        </w:tc>
+        <w:tc>
+          <w:tcPr>
+            <w:tcW w:type="dxa" w:w="4166"/>
+            <w:tcBorders>
+              <w:top w:val="single" w:color="C7D2DA" w:sz="2"/>
+              <w:left w:val="single" w:color="C7D2DA" w:sz="2"/>
+              <w:bottom w:val="single" w:color="C7D2DA" w:sz="2"/>
+              <w:right w:val="single" w:color="C7D2DA" w:sz="2"/>
+            </w:tcBorders>
+            <w:shd w:fill="F7F9FB" w:color="auto" w:val="clear"/>
+            <w:tcMar>
+              <w:top w:type="dxa" w:w="0"/>
+              <w:left w:type="dxa" w:w="80"/>
+              <w:bottom w:type="dxa" w:w="0"/>
+              <w:right w:type="dxa" w:w="80"/>
+            </w:tcMar>
+            <w:vAlign w:val="center"/>
+          </w:tcPr>
+          <w:p>
+            <w:pPr>
+              <w:spacing w:after="60" w:before="60" w:line="240"/>
+              <w:jc w:val="left"/>
+            </w:pPr>
+            <w:r>
+              <w:rPr>
+                <w:rFonts w:ascii="Aptos" w:cs="Aptos" w:eastAsia="Aptos" w:hAnsi="Aptos"/>
+                <w:color w:val="1A1A1A"/>
+                <w:sz w:val="15"/>
+                <w:szCs w:val="15"/>
+              </w:rPr>
+              <w:t xml:space="preserve">Scope and data requirements for profit and reinvestment tracking</w:t>
+            </w:r>
+          </w:p>
+        </w:tc>
+        <w:tc>
+          <w:tcPr>
+            <w:tcW w:type="dxa" w:w="2200"/>
+            <w:tcBorders>
+              <w:top w:val="single" w:color="C7D2DA" w:sz="2"/>
+              <w:left w:val="single" w:color="C7D2DA" w:sz="2"/>
+              <w:bottom w:val="single" w:color="C7D2DA" w:sz="2"/>
+              <w:right w:val="single" w:color="C7D2DA" w:sz="2"/>
+            </w:tcBorders>
+            <w:shd w:fill="F7F9FB" w:color="auto" w:val="clear"/>
+            <w:tcMar>
+              <w:top w:type="dxa" w:w="0"/>
+              <w:left w:type="dxa" w:w="80"/>
+              <w:bottom w:type="dxa" w:w="0"/>
+              <w:right w:type="dxa" w:w="80"/>
+            </w:tcMar>
+            <w:vAlign w:val="center"/>
+          </w:tcPr>
+          <w:p>
+            <w:pPr>
+              <w:spacing w:after="60" w:before="60" w:line="240"/>
+              <w:jc w:val="both"/>
+            </w:pPr>
+            <w:r>
+              <w:rPr>
+                <w:rFonts w:ascii="Aptos" w:cs="Aptos" w:eastAsia="Aptos" w:hAnsi="Aptos"/>
+                <w:color w:val="1A1A1A"/>
+                <w:sz w:val="14"/>
+                <w:szCs w:val="14"/>
+              </w:rPr>
+              <w:t xml:space="preserve">Mineral market intelligence expert</w:t>
+            </w:r>
+          </w:p>
+        </w:tc>
+        <w:tc>
+          <w:tcPr>
+            <w:tcW w:type="dxa" w:w="1700"/>
+            <w:tcBorders>
+              <w:top w:val="single" w:color="C7D2DA" w:sz="2"/>
+              <w:left w:val="single" w:color="C7D2DA" w:sz="2"/>
+              <w:bottom w:val="single" w:color="C7D2DA" w:sz="2"/>
+              <w:right w:val="single" w:color="C7D2DA" w:sz="2"/>
+            </w:tcBorders>
+            <w:shd w:fill="F7F9FB" w:color="auto" w:val="clear"/>
+            <w:tcMar>
+              <w:top w:type="dxa" w:w="0"/>
+              <w:left w:type="dxa" w:w="80"/>
+              <w:bottom w:type="dxa" w:w="0"/>
+              <w:right w:type="dxa" w:w="80"/>
+            </w:tcMar>
+            <w:vAlign w:val="center"/>
+          </w:tcPr>
+          <w:p>
+            <w:pPr>
+              <w:spacing w:after="60" w:before="60" w:line="240"/>
+              <w:jc w:val="center"/>
+            </w:pPr>
+            <w:r>
+              <w:rPr>
+                <w:rFonts w:ascii="Aptos" w:cs="Aptos" w:eastAsia="Aptos" w:hAnsi="Aptos"/>
+                <w:b/>
+                <w:bCs/>
+                <w:color w:val="0B2A3D"/>
+                <w:sz w:val="14"/>
+                <w:szCs w:val="14"/>
+              </w:rPr>
+              <w:t xml:space="preserve">15 Nov 2026 (D+75)</w:t>
+            </w:r>
+          </w:p>
+        </w:tc>
+        <w:tc>
+          <w:tcPr>
+            <w:tcW w:type="dxa" w:w="1500"/>
+            <w:tcBorders>
+              <w:top w:val="single" w:color="C7D2DA" w:sz="2"/>
+              <w:left w:val="single" w:color="C7D2DA" w:sz="2"/>
+              <w:bottom w:val="single" w:color="C7D2DA" w:sz="2"/>
+              <w:right w:val="single" w:color="C7D2DA" w:sz="2"/>
+            </w:tcBorders>
+            <w:shd w:fill="F7F9FB" w:color="auto" w:val="clear"/>
+            <w:tcMar>
+              <w:top w:type="dxa" w:w="0"/>
+              <w:left w:type="dxa" w:w="80"/>
+              <w:bottom w:type="dxa" w:w="0"/>
+              <w:right w:type="dxa" w:w="80"/>
+            </w:tcMar>
+            <w:vAlign w:val="center"/>
+          </w:tcPr>
+          <w:p>
+            <w:pPr>
+              <w:spacing w:after="60" w:before="60" w:line="240"/>
+              <w:jc w:val="center"/>
+            </w:pPr>
+            <w:r>
+              <w:rPr>
+                <w:rFonts w:ascii="Aptos" w:cs="Aptos" w:eastAsia="Aptos" w:hAnsi="Aptos"/>
+                <w:color w:val="1A1A1A"/>
+                <w:sz w:val="14"/>
+                <w:szCs w:val="14"/>
+              </w:rPr>
+              <w:t xml:space="preserve">46 days (~2 months)</w:t>
+            </w:r>
+          </w:p>
+        </w:tc>
+      </w:tr>
+      <w:tr>
+        <w:tc>
+          <w:tcPr>
+            <w:tcW w:type="dxa" w:w="640"/>
+            <w:tcBorders>
+              <w:top w:val="single" w:color="C7D2DA" w:sz="2"/>
+              <w:left w:val="single" w:color="C7D2DA" w:sz="2"/>
+              <w:bottom w:val="single" w:color="C7D2DA" w:sz="2"/>
+              <w:right w:val="single" w:color="C7D2DA" w:sz="2"/>
+            </w:tcBorders>
+            <w:tcMar>
+              <w:top w:type="dxa" w:w="0"/>
+              <w:left w:type="dxa" w:w="80"/>
+              <w:bottom w:type="dxa" w:w="0"/>
+              <w:right w:type="dxa" w:w="80"/>
+            </w:tcMar>
+            <w:vAlign w:val="center"/>
+          </w:tcPr>
+          <w:p>
+            <w:pPr>
+              <w:spacing w:after="60" w:before="60" w:line="240"/>
+              <w:jc w:val="center"/>
+            </w:pPr>
+            <w:r>
+              <w:rPr>
+                <w:rFonts w:ascii="Aptos" w:cs="Aptos" w:eastAsia="Aptos" w:hAnsi="Aptos"/>
+                <w:b/>
+                <w:bCs/>
+                <w:color w:val="0B2A3D"/>
+                <w:sz w:val="15"/>
+                <w:szCs w:val="15"/>
+              </w:rPr>
+              <w:t xml:space="preserve">A3.7</w:t>
+            </w:r>
+          </w:p>
+        </w:tc>
+        <w:tc>
+          <w:tcPr>
+            <w:tcW w:type="dxa" w:w="4166"/>
+            <w:tcBorders>
+              <w:top w:val="single" w:color="C7D2DA" w:sz="2"/>
+              <w:left w:val="single" w:color="C7D2DA" w:sz="2"/>
+              <w:bottom w:val="single" w:color="C7D2DA" w:sz="2"/>
+              <w:right w:val="single" w:color="C7D2DA" w:sz="2"/>
+            </w:tcBorders>
+            <w:tcMar>
+              <w:top w:type="dxa" w:w="0"/>
+              <w:left w:type="dxa" w:w="80"/>
+              <w:bottom w:type="dxa" w:w="0"/>
+              <w:right w:type="dxa" w:w="80"/>
+            </w:tcMar>
+            <w:vAlign w:val="center"/>
+          </w:tcPr>
+          <w:p>
+            <w:pPr>
+              <w:spacing w:after="60" w:before="60" w:line="240"/>
+              <w:jc w:val="left"/>
+            </w:pPr>
+            <w:r>
+              <w:rPr>
+                <w:rFonts w:ascii="Aptos" w:cs="Aptos" w:eastAsia="Aptos" w:hAnsi="Aptos"/>
+                <w:color w:val="1A1A1A"/>
+                <w:sz w:val="15"/>
+                <w:szCs w:val="15"/>
+              </w:rPr>
+              <w:t xml:space="preserve">Indicative profit-and-reinvestment estimate, 2024 to date</w:t>
+            </w:r>
+          </w:p>
+        </w:tc>
+        <w:tc>
+          <w:tcPr>
+            <w:tcW w:type="dxa" w:w="2200"/>
+            <w:tcBorders>
+              <w:top w:val="single" w:color="C7D2DA" w:sz="2"/>
+              <w:left w:val="single" w:color="C7D2DA" w:sz="2"/>
+              <w:bottom w:val="single" w:color="C7D2DA" w:sz="2"/>
+              <w:right w:val="single" w:color="C7D2DA" w:sz="2"/>
+            </w:tcBorders>
+            <w:tcMar>
+              <w:top w:type="dxa" w:w="0"/>
+              <w:left w:type="dxa" w:w="80"/>
+              <w:bottom w:type="dxa" w:w="0"/>
+              <w:right w:type="dxa" w:w="80"/>
+            </w:tcMar>
+            <w:vAlign w:val="center"/>
+          </w:tcPr>
+          <w:p>
+            <w:pPr>
+              <w:spacing w:after="60" w:before="60" w:line="240"/>
+              <w:jc w:val="both"/>
+            </w:pPr>
+            <w:r>
+              <w:rPr>
+                <w:rFonts w:ascii="Aptos" w:cs="Aptos" w:eastAsia="Aptos" w:hAnsi="Aptos"/>
+                <w:color w:val="1A1A1A"/>
+                <w:sz w:val="14"/>
+                <w:szCs w:val="14"/>
+              </w:rPr>
+              <w:t xml:space="preserve">Mineral market intelligence expert</w:t>
+            </w:r>
+          </w:p>
+        </w:tc>
+        <w:tc>
+          <w:tcPr>
+            <w:tcW w:type="dxa" w:w="1700"/>
+            <w:tcBorders>
+              <w:top w:val="single" w:color="C7D2DA" w:sz="2"/>
+              <w:left w:val="single" w:color="C7D2DA" w:sz="2"/>
+              <w:bottom w:val="single" w:color="C7D2DA" w:sz="2"/>
+              <w:right w:val="single" w:color="C7D2DA" w:sz="2"/>
+            </w:tcBorders>
+            <w:tcMar>
+              <w:top w:type="dxa" w:w="0"/>
+              <w:left w:type="dxa" w:w="80"/>
+              <w:bottom w:type="dxa" w:w="0"/>
+              <w:right w:type="dxa" w:w="80"/>
+            </w:tcMar>
+            <w:vAlign w:val="center"/>
+          </w:tcPr>
+          <w:p>
+            <w:pPr>
+              <w:spacing w:after="60" w:before="60" w:line="240"/>
+              <w:jc w:val="center"/>
+            </w:pPr>
+            <w:r>
+              <w:rPr>
+                <w:rFonts w:ascii="Aptos" w:cs="Aptos" w:eastAsia="Aptos" w:hAnsi="Aptos"/>
+                <w:b/>
+                <w:bCs/>
+                <w:color w:val="0B2A3D"/>
+                <w:sz w:val="14"/>
+                <w:szCs w:val="14"/>
+              </w:rPr>
+              <w:t xml:space="preserve">30 Nov 2026 (D+90)</w:t>
+            </w:r>
+          </w:p>
+        </w:tc>
+        <w:tc>
+          <w:tcPr>
+            <w:tcW w:type="dxa" w:w="1500"/>
+            <w:tcBorders>
+              <w:top w:val="single" w:color="C7D2DA" w:sz="2"/>
+              <w:left w:val="single" w:color="C7D2DA" w:sz="2"/>
+              <w:bottom w:val="single" w:color="C7D2DA" w:sz="2"/>
+              <w:right w:val="single" w:color="C7D2DA" w:sz="2"/>
+            </w:tcBorders>
+            <w:tcMar>
+              <w:top w:type="dxa" w:w="0"/>
+              <w:left w:type="dxa" w:w="80"/>
+              <w:bottom w:type="dxa" w:w="0"/>
+              <w:right w:type="dxa" w:w="80"/>
+            </w:tcMar>
+            <w:vAlign w:val="center"/>
+          </w:tcPr>
+          <w:p>
+            <w:pPr>
+              <w:spacing w:after="60" w:before="60" w:line="240"/>
+              <w:jc w:val="center"/>
+            </w:pPr>
+            <w:r>
+              <w:rPr>
+                <w:rFonts w:ascii="Aptos" w:cs="Aptos" w:eastAsia="Aptos" w:hAnsi="Aptos"/>
+                <w:color w:val="1A1A1A"/>
+                <w:sz w:val="14"/>
+                <w:szCs w:val="14"/>
+              </w:rPr>
+              <w:t xml:space="preserve">46 days (~2 months)</w:t>
             </w:r>
           </w:p>
         </w:tc>

</xml_diff>